<commit_message>
docs: added Module2c1; feat: initialized Project directory structure
</commit_message>
<xml_diff>
--- a/book/module-01/Module1c1.docx
+++ b/book/module-01/Module1c1.docx
@@ -1,77 +1,101 @@
 
 <file path=word/document.xml><?xml version="1.0" encoding="utf-8"?>
-<w:document xmlns:o="urn:schemas-microsoft-com:office:office" xmlns:r="http://schemas.openxmlformats.org/officeDocument/2006/relationships" xmlns:v="urn:schemas-microsoft-com:vml" xmlns:w="http://schemas.openxmlformats.org/wordprocessingml/2006/main" xmlns:w10="urn:schemas-microsoft-com:office:word" xmlns:wp="http://schemas.openxmlformats.org/drawingml/2006/wordprocessingDrawing" xmlns:pic="http://schemas.openxmlformats.org/drawingml/2006/picture" xmlns:wps="http://schemas.microsoft.com/office/word/2010/wordprocessingShape" xmlns:wpg="http://schemas.microsoft.com/office/word/2010/wordprocessingGroup" xmlns:mc="http://schemas.openxmlformats.org/markup-compatibility/2006" xmlns:wp14="http://schemas.microsoft.com/office/word/2010/wordprocessingDrawing" xmlns:w14="http://schemas.microsoft.com/office/word/2010/wordml" xmlns:w15="http://schemas.microsoft.com/office/word/2012/wordml" mc:Ignorable="w14 wp14 w15">
+<w:document xmlns:wpc="http://schemas.microsoft.com/office/word/2010/wordprocessingCanvas" xmlns:mc="http://schemas.openxmlformats.org/markup-compatibility/2006" xmlns:o="urn:schemas-microsoft-com:office:office" xmlns:r="http://schemas.openxmlformats.org/officeDocument/2006/relationships" xmlns:m="http://schemas.openxmlformats.org/officeDocument/2006/math" xmlns:v="urn:schemas-microsoft-com:vml" xmlns:wp14="http://schemas.microsoft.com/office/word/2010/wordprocessingDrawing" xmlns:wp="http://schemas.openxmlformats.org/drawingml/2006/wordprocessingDrawing" xmlns:w10="urn:schemas-microsoft-com:office:word" xmlns:w="http://schemas.openxmlformats.org/wordprocessingml/2006/main" xmlns:w14="http://schemas.microsoft.com/office/word/2010/wordml" xmlns:w15="http://schemas.microsoft.com/office/word/2012/wordml" xmlns:w16se="http://schemas.microsoft.com/office/word/2015/wordml/symex" xmlns:w16cid="http://schemas.microsoft.com/office/word/2016/wordml/cid" xmlns:w16="http://schemas.microsoft.com/office/word/2018/wordml" xmlns:w16cex="http://schemas.microsoft.com/office/word/2018/wordml/cex" xmlns:w16sdtdh="http://schemas.microsoft.com/office/word/2020/wordml/sdtdatahash" xmlns:wne="http://schemas.microsoft.com/office/word/2006/wordml" xmlns:wpg="http://schemas.microsoft.com/office/word/2010/wordprocessingGroup" xmlns:wps="http://schemas.microsoft.com/office/word/2010/wordprocessingShape" mc:Ignorable="w14 w15 w16se w16cid w16 w16cex w16sdtdh wp14">
   <w:body>
     <w:p>
       <w:pPr>
         <w:pStyle w:val="Heading3"/>
-        <w:bidi w:val="0"/>
         <w:spacing w:before="140" w:after="120"/>
         <w:jc w:val="start"/>
-        <w:rPr/>
-      </w:pPr>
-      <w:r>
-        <w:rPr/>
+      </w:pPr>
+      <w:r>
+        <w:rPr>
+          <w:rFonts w:ascii="Liberation Serif" w:hAnsi="Liberation Serif" w:eastAsia="Songti SC" w:cs="Arial Unicode MS"/>
+          <w:b/>
+          <w:bCs/>
+          <w:kern w:val="2"/>
+          <w:sz w:val="28"/>
+          <w:szCs w:val="28"/>
+        </w:rPr>
         <w:t>Module 1 — Understanding Agentic AI</w:t>
       </w:r>
     </w:p>
     <w:p>
       <w:pPr>
         <w:pStyle w:val="Heading3"/>
-        <w:bidi w:val="0"/>
-        <w:jc w:val="start"/>
-        <w:rPr/>
-      </w:pPr>
-      <w:r>
-        <w:rPr/>
+        <w:jc w:val="start"/>
+      </w:pPr>
+      <w:r>
+        <w:rPr>
+          <w:rFonts w:ascii="Liberation Serif" w:hAnsi="Liberation Serif" w:eastAsia="Songti SC" w:cs="Arial Unicode MS"/>
+          <w:b/>
+          <w:bCs/>
+          <w:kern w:val="2"/>
+          <w:sz w:val="28"/>
+          <w:szCs w:val="28"/>
+        </w:rPr>
         <w:t>Chapter 1 — From AI Chatbot to AI Employee</w:t>
       </w:r>
     </w:p>
     <w:p>
       <w:pPr>
         <w:pStyle w:val="BodyText"/>
-        <w:bidi w:val="0"/>
-        <w:jc w:val="start"/>
-        <w:rPr/>
-      </w:pPr>
-      <w:r>
-        <w:rPr/>
+        <w:jc w:val="start"/>
+      </w:pPr>
+      <w:r>
+        <w:rPr>
+          <w:rFonts w:ascii="Liberation Serif" w:hAnsi="Liberation Serif" w:eastAsia="Songti SC" w:cs="Arial Unicode MS"/>
+          <w:kern w:val="2"/>
+          <w:sz w:val="24"/>
+          <w:szCs w:val="24"/>
+        </w:rPr>
         <w:t>Estimated reading time: 15–20 minutes</w:t>
       </w:r>
     </w:p>
     <w:p>
       <w:pPr>
         <w:pStyle w:val="BodyText"/>
-        <w:bidi w:val="0"/>
-        <w:jc w:val="start"/>
-        <w:rPr/>
-      </w:pPr>
-      <w:r>
-        <w:rPr/>
+        <w:jc w:val="start"/>
+      </w:pPr>
+      <w:r>
+        <w:rPr>
+          <w:rFonts w:ascii="Liberation Serif" w:hAnsi="Liberation Serif" w:eastAsia="Songti SC" w:cs="Arial Unicode MS"/>
+          <w:kern w:val="2"/>
+          <w:sz w:val="24"/>
+          <w:szCs w:val="24"/>
+        </w:rPr>
         <w:t>Difficulty: Beginner</w:t>
       </w:r>
     </w:p>
     <w:p>
       <w:pPr>
         <w:pStyle w:val="Heading3"/>
-        <w:bidi w:val="0"/>
-        <w:jc w:val="start"/>
-        <w:rPr/>
-      </w:pPr>
-      <w:r>
-        <w:rPr/>
+        <w:jc w:val="start"/>
+      </w:pPr>
+      <w:r>
+        <w:rPr>
+          <w:rFonts w:ascii="Liberation Serif" w:hAnsi="Liberation Serif" w:eastAsia="Songti SC" w:cs="Arial Unicode MS"/>
+          <w:b/>
+          <w:bCs/>
+          <w:kern w:val="2"/>
+          <w:sz w:val="28"/>
+          <w:szCs w:val="28"/>
+        </w:rPr>
         <w:t>Learning Objectives</w:t>
       </w:r>
     </w:p>
     <w:p>
       <w:pPr>
         <w:pStyle w:val="BodyText"/>
-        <w:bidi w:val="0"/>
-        <w:jc w:val="start"/>
-        <w:rPr/>
-      </w:pPr>
-      <w:r>
-        <w:rPr/>
+        <w:jc w:val="start"/>
+      </w:pPr>
+      <w:r>
+        <w:rPr>
+          <w:rFonts w:ascii="Liberation Serif" w:hAnsi="Liberation Serif" w:eastAsia="Songti SC" w:cs="Arial Unicode MS"/>
+          <w:kern w:val="2"/>
+          <w:sz w:val="24"/>
+          <w:szCs w:val="24"/>
+        </w:rPr>
         <w:t>By the end of this chapter, you will be able to:</w:t>
       </w:r>
     </w:p>
@@ -84,15 +108,18 @@
         </w:numPr>
         <w:tabs>
           <w:tab w:val="clear" w:pos="709"/>
-          <w:tab w:val="left" w:pos="709" w:leader="none"/>
-        </w:tabs>
-        <w:bidi w:val="0"/>
-        <w:ind w:hanging="283" w:start="709"/>
-        <w:jc w:val="start"/>
-        <w:rPr/>
-      </w:pPr>
-      <w:r>
-        <w:rPr/>
+          <w:tab w:val="left" w:pos="709"/>
+        </w:tabs>
+        <w:ind w:left="709" w:hanging="283"/>
+        <w:jc w:val="start"/>
+      </w:pPr>
+      <w:r>
+        <w:rPr>
+          <w:rFonts w:ascii="Liberation Serif" w:hAnsi="Liberation Serif" w:eastAsia="Songti SC" w:cs="Arial Unicode MS"/>
+          <w:kern w:val="2"/>
+          <w:sz w:val="24"/>
+          <w:szCs w:val="24"/>
+        </w:rPr>
         <w:t>Explain the difference between Generative AI and an AI Agent.</w:t>
       </w:r>
     </w:p>
@@ -105,15 +132,18 @@
         </w:numPr>
         <w:tabs>
           <w:tab w:val="clear" w:pos="709"/>
-          <w:tab w:val="left" w:pos="709" w:leader="none"/>
-        </w:tabs>
-        <w:bidi w:val="0"/>
-        <w:ind w:hanging="283" w:start="709"/>
-        <w:jc w:val="start"/>
-        <w:rPr/>
-      </w:pPr>
-      <w:r>
-        <w:rPr/>
+          <w:tab w:val="left" w:pos="709"/>
+        </w:tabs>
+        <w:ind w:left="709" w:hanging="283"/>
+        <w:jc w:val="start"/>
+      </w:pPr>
+      <w:r>
+        <w:rPr>
+          <w:rFonts w:ascii="Liberation Serif" w:hAnsi="Liberation Serif" w:eastAsia="Songti SC" w:cs="Arial Unicode MS"/>
+          <w:kern w:val="2"/>
+          <w:sz w:val="24"/>
+          <w:szCs w:val="24"/>
+        </w:rPr>
         <w:t>Describe why a chatbot is not the same as an autonomous worker.</w:t>
       </w:r>
     </w:p>
@@ -126,15 +156,18 @@
         </w:numPr>
         <w:tabs>
           <w:tab w:val="clear" w:pos="709"/>
-          <w:tab w:val="left" w:pos="709" w:leader="none"/>
-        </w:tabs>
-        <w:bidi w:val="0"/>
-        <w:ind w:hanging="283" w:start="709"/>
-        <w:jc w:val="start"/>
-        <w:rPr/>
-      </w:pPr>
-      <w:r>
-        <w:rPr/>
+          <w:tab w:val="left" w:pos="709"/>
+        </w:tabs>
+        <w:ind w:left="709" w:hanging="283"/>
+        <w:jc w:val="start"/>
+      </w:pPr>
+      <w:r>
+        <w:rPr>
+          <w:rFonts w:ascii="Liberation Serif" w:hAnsi="Liberation Serif" w:eastAsia="Songti SC" w:cs="Arial Unicode MS"/>
+          <w:kern w:val="2"/>
+          <w:sz w:val="24"/>
+          <w:szCs w:val="24"/>
+        </w:rPr>
         <w:t>Identify the four capabilities that make an AI system "agentic."</w:t>
       </w:r>
     </w:p>
@@ -147,75 +180,82 @@
         </w:numPr>
         <w:tabs>
           <w:tab w:val="clear" w:pos="709"/>
-          <w:tab w:val="left" w:pos="709" w:leader="none"/>
-        </w:tabs>
-        <w:bidi w:val="0"/>
-        <w:ind w:hanging="283" w:start="709"/>
-        <w:jc w:val="start"/>
-        <w:rPr/>
-      </w:pPr>
-      <w:r>
-        <w:rPr/>
+          <w:tab w:val="left" w:pos="709"/>
+        </w:tabs>
+        <w:ind w:left="709" w:hanging="283"/>
+        <w:jc w:val="start"/>
+      </w:pPr>
+      <w:r>
+        <w:rPr>
+          <w:rFonts w:ascii="Liberation Serif" w:hAnsi="Liberation Serif" w:eastAsia="Songti SC" w:cs="Arial Unicode MS"/>
+          <w:kern w:val="2"/>
+          <w:sz w:val="24"/>
+          <w:szCs w:val="24"/>
+        </w:rPr>
         <w:t>Relate these concepts directly to your Facebook Airbnb Marketing Agent project.</w:t>
       </w:r>
     </w:p>
     <w:p>
       <w:pPr>
         <w:pStyle w:val="Heading3"/>
-        <w:bidi w:val="0"/>
-        <w:jc w:val="start"/>
-        <w:rPr/>
-      </w:pPr>
-      <w:r>
-        <w:rPr/>
+        <w:jc w:val="start"/>
+      </w:pPr>
+      <w:r>
+        <w:rPr>
+          <w:rFonts w:ascii="Liberation Serif" w:hAnsi="Liberation Serif" w:eastAsia="Songti SC" w:cs="Arial Unicode MS"/>
+          <w:b/>
+          <w:bCs/>
+          <w:kern w:val="2"/>
+          <w:sz w:val="28"/>
+          <w:szCs w:val="28"/>
+        </w:rPr>
         <w:t>1.1 The Big Picture</w:t>
       </w:r>
     </w:p>
     <w:p>
       <w:pPr>
         <w:pStyle w:val="BodyText"/>
-        <w:bidi w:val="0"/>
-        <w:jc w:val="start"/>
-        <w:rPr/>
-      </w:pPr>
-      <w:r>
-        <w:rPr/>
+        <w:jc w:val="start"/>
+      </w:pPr>
+      <w:r>
+        <w:rPr>
+          <w:rFonts w:ascii="Liberation Serif" w:hAnsi="Liberation Serif" w:eastAsia="Songti SC" w:cs="Arial Unicode MS"/>
+          <w:kern w:val="2"/>
+          <w:sz w:val="24"/>
+          <w:szCs w:val="24"/>
+        </w:rPr>
         <w:t>Imagine you hire two people to help with your Airbnb business.</w:t>
       </w:r>
     </w:p>
     <w:p>
       <w:pPr>
-        <w:pStyle w:val="BodyText"/>
-        <w:bidi w:val="0"/>
-        <w:jc w:val="start"/>
-        <w:rPr/>
-      </w:pPr>
-      <w:r>
-        <w:rPr/>
-        <w:t>A</w:t>
-      </w:r>
-    </w:p>
-    <w:p>
-      <w:pPr>
         <w:pStyle w:val="Heading3"/>
-        <w:bidi w:val="0"/>
-        <w:jc w:val="start"/>
-        <w:rPr/>
-      </w:pPr>
-      <w:r>
-        <w:rPr/>
+        <w:jc w:val="start"/>
+      </w:pPr>
+      <w:r>
+        <w:rPr>
+          <w:rFonts w:ascii="Liberation Serif" w:hAnsi="Liberation Serif" w:eastAsia="Songti SC" w:cs="Arial Unicode MS"/>
+          <w:b/>
+          <w:bCs/>
+          <w:kern w:val="2"/>
+          <w:sz w:val="28"/>
+          <w:szCs w:val="28"/>
+        </w:rPr>
         <w:t>Employee A</w:t>
       </w:r>
     </w:p>
     <w:p>
       <w:pPr>
         <w:pStyle w:val="BodyText"/>
-        <w:bidi w:val="0"/>
-        <w:jc w:val="start"/>
-        <w:rPr/>
-      </w:pPr>
-      <w:r>
-        <w:rPr/>
+        <w:jc w:val="start"/>
+      </w:pPr>
+      <w:r>
+        <w:rPr>
+          <w:rFonts w:ascii="Liberation Serif" w:hAnsi="Liberation Serif" w:eastAsia="Songti SC" w:cs="Arial Unicode MS"/>
+          <w:kern w:val="2"/>
+          <w:sz w:val="24"/>
+          <w:szCs w:val="24"/>
+        </w:rPr>
         <w:t>Answers questions only.</w:t>
       </w:r>
     </w:p>
@@ -228,15 +268,18 @@
         </w:numPr>
         <w:tabs>
           <w:tab w:val="clear" w:pos="709"/>
-          <w:tab w:val="left" w:pos="709" w:leader="none"/>
-        </w:tabs>
-        <w:bidi w:val="0"/>
-        <w:ind w:hanging="283" w:start="709"/>
-        <w:jc w:val="start"/>
-        <w:rPr/>
-      </w:pPr>
-      <w:r>
-        <w:rPr/>
+          <w:tab w:val="left" w:pos="709"/>
+        </w:tabs>
+        <w:ind w:left="709" w:hanging="283"/>
+        <w:jc w:val="start"/>
+      </w:pPr>
+      <w:r>
+        <w:rPr>
+          <w:rFonts w:ascii="Liberation Serif" w:hAnsi="Liberation Serif" w:eastAsia="Songti SC" w:cs="Arial Unicode MS"/>
+          <w:kern w:val="2"/>
+          <w:sz w:val="24"/>
+          <w:szCs w:val="24"/>
+        </w:rPr>
         <w:t>"How many guests can your Airbnb accommodate?"</w:t>
       </w:r>
     </w:p>
@@ -249,15 +292,18 @@
         </w:numPr>
         <w:tabs>
           <w:tab w:val="clear" w:pos="709"/>
-          <w:tab w:val="left" w:pos="709" w:leader="none"/>
-        </w:tabs>
-        <w:bidi w:val="0"/>
-        <w:ind w:hanging="283" w:start="709"/>
-        <w:jc w:val="start"/>
-        <w:rPr/>
-      </w:pPr>
-      <w:r>
-        <w:rPr/>
+          <w:tab w:val="left" w:pos="709"/>
+        </w:tabs>
+        <w:ind w:left="709" w:hanging="283"/>
+        <w:jc w:val="start"/>
+      </w:pPr>
+      <w:r>
+        <w:rPr>
+          <w:rFonts w:ascii="Liberation Serif" w:hAnsi="Liberation Serif" w:eastAsia="Songti SC" w:cs="Arial Unicode MS"/>
+          <w:kern w:val="2"/>
+          <w:sz w:val="24"/>
+          <w:szCs w:val="24"/>
+        </w:rPr>
         <w:t>"Do you have WiFi?"</w:t>
       </w:r>
     </w:p>
@@ -270,63 +316,71 @@
         </w:numPr>
         <w:tabs>
           <w:tab w:val="clear" w:pos="709"/>
-          <w:tab w:val="left" w:pos="709" w:leader="none"/>
-        </w:tabs>
-        <w:bidi w:val="0"/>
-        <w:ind w:hanging="283" w:start="709"/>
-        <w:jc w:val="start"/>
-        <w:rPr/>
-      </w:pPr>
-      <w:r>
-        <w:rPr/>
+          <w:tab w:val="left" w:pos="709"/>
+        </w:tabs>
+        <w:ind w:left="709" w:hanging="283"/>
+        <w:jc w:val="start"/>
+      </w:pPr>
+      <w:r>
+        <w:rPr>
+          <w:rFonts w:ascii="Liberation Serif" w:hAnsi="Liberation Serif" w:eastAsia="Songti SC" w:cs="Arial Unicode MS"/>
+          <w:kern w:val="2"/>
+          <w:sz w:val="24"/>
+          <w:szCs w:val="24"/>
+        </w:rPr>
         <w:t>"Where is the property located?"</w:t>
       </w:r>
     </w:p>
     <w:p>
       <w:pPr>
         <w:pStyle w:val="BodyText"/>
-        <w:bidi w:val="0"/>
-        <w:jc w:val="start"/>
-        <w:rPr/>
-      </w:pPr>
-      <w:r>
-        <w:rPr/>
+        <w:jc w:val="start"/>
+      </w:pPr>
+      <w:r>
+        <w:rPr>
+          <w:rFonts w:ascii="Liberation Serif" w:hAnsi="Liberation Serif" w:eastAsia="Songti SC" w:cs="Arial Unicode MS"/>
+          <w:kern w:val="2"/>
+          <w:sz w:val="24"/>
+          <w:szCs w:val="24"/>
+        </w:rPr>
         <w:t>After answering, the work stops.</w:t>
       </w:r>
     </w:p>
     <w:p>
       <w:pPr>
         <w:pStyle w:val="BodyText"/>
-        <w:bidi w:val="0"/>
-        <w:jc w:val="start"/>
-        <w:rPr/>
-      </w:pPr>
-      <w:r>
-        <w:rPr/>
-        <w:t>B</w:t>
-      </w:r>
+        <w:jc w:val="start"/>
+      </w:pPr>
     </w:p>
     <w:p>
       <w:pPr>
         <w:pStyle w:val="Heading3"/>
-        <w:bidi w:val="0"/>
-        <w:jc w:val="start"/>
-        <w:rPr/>
-      </w:pPr>
-      <w:r>
-        <w:rPr/>
+        <w:jc w:val="start"/>
+      </w:pPr>
+      <w:r>
+        <w:rPr>
+          <w:rFonts w:ascii="Liberation Serif" w:hAnsi="Liberation Serif" w:eastAsia="Songti SC" w:cs="Arial Unicode MS"/>
+          <w:b/>
+          <w:bCs/>
+          <w:kern w:val="2"/>
+          <w:sz w:val="28"/>
+          <w:szCs w:val="28"/>
+        </w:rPr>
         <w:t>Employee B</w:t>
       </w:r>
     </w:p>
     <w:p>
       <w:pPr>
         <w:pStyle w:val="BodyText"/>
-        <w:bidi w:val="0"/>
-        <w:jc w:val="start"/>
-        <w:rPr/>
-      </w:pPr>
-      <w:r>
-        <w:rPr/>
+        <w:jc w:val="start"/>
+      </w:pPr>
+      <w:r>
+        <w:rPr>
+          <w:rFonts w:ascii="Liberation Serif" w:hAnsi="Liberation Serif" w:eastAsia="Songti SC" w:cs="Arial Unicode MS"/>
+          <w:kern w:val="2"/>
+          <w:sz w:val="24"/>
+          <w:szCs w:val="24"/>
+        </w:rPr>
         <w:t>Actually helps run the business.</w:t>
       </w:r>
     </w:p>
@@ -339,15 +393,18 @@
         </w:numPr>
         <w:tabs>
           <w:tab w:val="clear" w:pos="709"/>
-          <w:tab w:val="left" w:pos="709" w:leader="none"/>
-        </w:tabs>
-        <w:bidi w:val="0"/>
-        <w:ind w:hanging="283" w:start="709"/>
-        <w:jc w:val="start"/>
-        <w:rPr/>
-      </w:pPr>
-      <w:r>
-        <w:rPr/>
+          <w:tab w:val="left" w:pos="709"/>
+        </w:tabs>
+        <w:ind w:left="709" w:hanging="283"/>
+        <w:jc w:val="start"/>
+      </w:pPr>
+      <w:r>
+        <w:rPr>
+          <w:rFonts w:ascii="Liberation Serif" w:hAnsi="Liberation Serif" w:eastAsia="Songti SC" w:cs="Arial Unicode MS"/>
+          <w:kern w:val="2"/>
+          <w:sz w:val="24"/>
+          <w:szCs w:val="24"/>
+        </w:rPr>
         <w:t>Reads new Facebook posts.</w:t>
       </w:r>
     </w:p>
@@ -360,15 +417,18 @@
         </w:numPr>
         <w:tabs>
           <w:tab w:val="clear" w:pos="709"/>
-          <w:tab w:val="left" w:pos="709" w:leader="none"/>
-        </w:tabs>
-        <w:bidi w:val="0"/>
-        <w:ind w:hanging="283" w:start="709"/>
-        <w:jc w:val="start"/>
-        <w:rPr/>
-      </w:pPr>
-      <w:r>
-        <w:rPr/>
+          <w:tab w:val="left" w:pos="709"/>
+        </w:tabs>
+        <w:ind w:left="709" w:hanging="283"/>
+        <w:jc w:val="start"/>
+      </w:pPr>
+      <w:r>
+        <w:rPr>
+          <w:rFonts w:ascii="Liberation Serif" w:hAnsi="Liberation Serif" w:eastAsia="Songti SC" w:cs="Arial Unicode MS"/>
+          <w:kern w:val="2"/>
+          <w:sz w:val="24"/>
+          <w:szCs w:val="24"/>
+        </w:rPr>
         <w:t>Determines whether someone is looking for accommodation.</w:t>
       </w:r>
     </w:p>
@@ -381,15 +441,18 @@
         </w:numPr>
         <w:tabs>
           <w:tab w:val="clear" w:pos="709"/>
-          <w:tab w:val="left" w:pos="709" w:leader="none"/>
-        </w:tabs>
-        <w:bidi w:val="0"/>
-        <w:ind w:hanging="283" w:start="709"/>
-        <w:jc w:val="start"/>
-        <w:rPr/>
-      </w:pPr>
-      <w:r>
-        <w:rPr/>
+          <w:tab w:val="left" w:pos="709"/>
+        </w:tabs>
+        <w:ind w:left="709" w:hanging="283"/>
+        <w:jc w:val="start"/>
+      </w:pPr>
+      <w:r>
+        <w:rPr>
+          <w:rFonts w:ascii="Liberation Serif" w:hAnsi="Liberation Serif" w:eastAsia="Songti SC" w:cs="Arial Unicode MS"/>
+          <w:kern w:val="2"/>
+          <w:sz w:val="24"/>
+          <w:szCs w:val="24"/>
+        </w:rPr>
         <w:t>Checks your calendar.</w:t>
       </w:r>
     </w:p>
@@ -402,15 +465,18 @@
         </w:numPr>
         <w:tabs>
           <w:tab w:val="clear" w:pos="709"/>
-          <w:tab w:val="left" w:pos="709" w:leader="none"/>
-        </w:tabs>
-        <w:bidi w:val="0"/>
-        <w:ind w:hanging="283" w:start="709"/>
-        <w:jc w:val="start"/>
-        <w:rPr/>
-      </w:pPr>
-      <w:r>
-        <w:rPr/>
+          <w:tab w:val="left" w:pos="709"/>
+        </w:tabs>
+        <w:ind w:left="709" w:hanging="283"/>
+        <w:jc w:val="start"/>
+      </w:pPr>
+      <w:r>
+        <w:rPr>
+          <w:rFonts w:ascii="Liberation Serif" w:hAnsi="Liberation Serif" w:eastAsia="Songti SC" w:cs="Arial Unicode MS"/>
+          <w:kern w:val="2"/>
+          <w:sz w:val="24"/>
+          <w:szCs w:val="24"/>
+        </w:rPr>
         <w:t>Calculates availability.</w:t>
       </w:r>
     </w:p>
@@ -423,15 +489,18 @@
         </w:numPr>
         <w:tabs>
           <w:tab w:val="clear" w:pos="709"/>
-          <w:tab w:val="left" w:pos="709" w:leader="none"/>
-        </w:tabs>
-        <w:bidi w:val="0"/>
-        <w:ind w:hanging="283" w:start="709"/>
-        <w:jc w:val="start"/>
-        <w:rPr/>
-      </w:pPr>
-      <w:r>
-        <w:rPr/>
+          <w:tab w:val="left" w:pos="709"/>
+        </w:tabs>
+        <w:ind w:left="709" w:hanging="283"/>
+        <w:jc w:val="start"/>
+      </w:pPr>
+      <w:r>
+        <w:rPr>
+          <w:rFonts w:ascii="Liberation Serif" w:hAnsi="Liberation Serif" w:eastAsia="Songti SC" w:cs="Arial Unicode MS"/>
+          <w:kern w:val="2"/>
+          <w:sz w:val="24"/>
+          <w:szCs w:val="24"/>
+        </w:rPr>
         <w:t>Writes a persuasive reply.</w:t>
       </w:r>
     </w:p>
@@ -444,15 +513,18 @@
         </w:numPr>
         <w:tabs>
           <w:tab w:val="clear" w:pos="709"/>
-          <w:tab w:val="left" w:pos="709" w:leader="none"/>
-        </w:tabs>
-        <w:bidi w:val="0"/>
-        <w:ind w:hanging="283" w:start="709"/>
-        <w:jc w:val="start"/>
-        <w:rPr/>
-      </w:pPr>
-      <w:r>
-        <w:rPr/>
+          <w:tab w:val="left" w:pos="709"/>
+        </w:tabs>
+        <w:ind w:left="709" w:hanging="283"/>
+        <w:jc w:val="start"/>
+      </w:pPr>
+      <w:r>
+        <w:rPr>
+          <w:rFonts w:ascii="Liberation Serif" w:hAnsi="Liberation Serif" w:eastAsia="Songti SC" w:cs="Arial Unicode MS"/>
+          <w:kern w:val="2"/>
+          <w:sz w:val="24"/>
+          <w:szCs w:val="24"/>
+        </w:rPr>
         <w:t>Posts the reply.</w:t>
       </w:r>
     </w:p>
@@ -465,87 +537,110 @@
         </w:numPr>
         <w:tabs>
           <w:tab w:val="clear" w:pos="709"/>
-          <w:tab w:val="left" w:pos="709" w:leader="none"/>
-        </w:tabs>
-        <w:bidi w:val="0"/>
-        <w:ind w:hanging="283" w:start="709"/>
-        <w:jc w:val="start"/>
-        <w:rPr/>
-      </w:pPr>
-      <w:r>
-        <w:rPr/>
+          <w:tab w:val="left" w:pos="709"/>
+        </w:tabs>
+        <w:ind w:left="709" w:hanging="283"/>
+        <w:jc w:val="start"/>
+      </w:pPr>
+      <w:r>
+        <w:rPr>
+          <w:rFonts w:ascii="Liberation Serif" w:hAnsi="Liberation Serif" w:eastAsia="Songti SC" w:cs="Arial Unicode MS"/>
+          <w:kern w:val="2"/>
+          <w:sz w:val="24"/>
+          <w:szCs w:val="24"/>
+        </w:rPr>
         <w:t>Records the interaction.</w:t>
       </w:r>
     </w:p>
     <w:p>
       <w:pPr>
         <w:pStyle w:val="BodyText"/>
-        <w:bidi w:val="0"/>
-        <w:jc w:val="start"/>
-        <w:rPr/>
-      </w:pPr>
-      <w:r>
-        <w:rPr/>
+        <w:jc w:val="start"/>
+      </w:pPr>
+      <w:r>
+        <w:rPr>
+          <w:rFonts w:ascii="Liberation Serif" w:hAnsi="Liberation Serif" w:eastAsia="Songti SC" w:cs="Arial Unicode MS"/>
+          <w:kern w:val="2"/>
+          <w:sz w:val="24"/>
+          <w:szCs w:val="24"/>
+        </w:rPr>
         <w:t>Employee B is far more valuable.</w:t>
       </w:r>
     </w:p>
     <w:p>
       <w:pPr>
         <w:pStyle w:val="BodyText"/>
-        <w:bidi w:val="0"/>
-        <w:jc w:val="start"/>
-        <w:rPr/>
-      </w:pPr>
-      <w:r>
-        <w:rPr/>
+        <w:jc w:val="start"/>
+      </w:pPr>
+      <w:r>
+        <w:rPr>
+          <w:rFonts w:ascii="Liberation Serif" w:hAnsi="Liberation Serif" w:eastAsia="Songti SC" w:cs="Arial Unicode MS"/>
+          <w:kern w:val="2"/>
+          <w:sz w:val="24"/>
+          <w:szCs w:val="24"/>
+        </w:rPr>
         <w:t>Employee A is a chatbot.</w:t>
       </w:r>
     </w:p>
     <w:p>
       <w:pPr>
         <w:pStyle w:val="BodyText"/>
-        <w:bidi w:val="0"/>
-        <w:jc w:val="start"/>
-        <w:rPr/>
-      </w:pPr>
-      <w:r>
-        <w:rPr/>
+        <w:jc w:val="start"/>
+      </w:pPr>
+      <w:r>
+        <w:rPr>
+          <w:rFonts w:ascii="Liberation Serif" w:hAnsi="Liberation Serif" w:eastAsia="Songti SC" w:cs="Arial Unicode MS"/>
+          <w:kern w:val="2"/>
+          <w:sz w:val="24"/>
+          <w:szCs w:val="24"/>
+        </w:rPr>
         <w:t>Employee B is an AI agent.</w:t>
       </w:r>
     </w:p>
     <w:p>
       <w:pPr>
         <w:pStyle w:val="BodyText"/>
-        <w:bidi w:val="0"/>
-        <w:jc w:val="start"/>
-        <w:rPr/>
-      </w:pPr>
-      <w:r>
-        <w:rPr/>
+        <w:jc w:val="start"/>
+      </w:pPr>
+      <w:r>
+        <w:rPr>
+          <w:rFonts w:ascii="Liberation Serif" w:hAnsi="Liberation Serif" w:eastAsia="Songti SC" w:cs="Arial Unicode MS"/>
+          <w:kern w:val="2"/>
+          <w:sz w:val="24"/>
+          <w:szCs w:val="24"/>
+        </w:rPr>
         <w:t>That single distinction is the foundation of everything we will build.</w:t>
       </w:r>
     </w:p>
     <w:p>
       <w:pPr>
         <w:pStyle w:val="Heading3"/>
-        <w:bidi w:val="0"/>
-        <w:jc w:val="start"/>
-        <w:rPr/>
-      </w:pPr>
-      <w:r>
-        <w:rPr/>
+        <w:jc w:val="start"/>
+      </w:pPr>
+      <w:r>
+        <w:rPr>
+          <w:rFonts w:ascii="Liberation Serif" w:hAnsi="Liberation Serif" w:eastAsia="Songti SC" w:cs="Arial Unicode MS"/>
+          <w:b/>
+          <w:bCs/>
+          <w:kern w:val="2"/>
+          <w:sz w:val="28"/>
+          <w:szCs w:val="28"/>
+        </w:rPr>
         <w:t>1.2 What Is Generative AI?</w:t>
       </w:r>
     </w:p>
     <w:p>
       <w:pPr>
         <w:pStyle w:val="BodyText"/>
-        <w:bidi w:val="0"/>
-        <w:jc w:val="start"/>
-        <w:rPr/>
-      </w:pPr>
-      <w:r>
-        <w:rPr/>
+        <w:jc w:val="start"/>
+      </w:pPr>
+      <w:r>
+        <w:rPr>
+          <w:rFonts w:ascii="Liberation Serif" w:hAnsi="Liberation Serif" w:eastAsia="Songti SC" w:cs="Arial Unicode MS"/>
+          <w:kern w:val="2"/>
+          <w:sz w:val="24"/>
+          <w:szCs w:val="24"/>
+        </w:rPr>
         <w:t>Generative AI is a system that can create new content such as:</w:t>
       </w:r>
     </w:p>
@@ -558,15 +653,18 @@
         </w:numPr>
         <w:tabs>
           <w:tab w:val="clear" w:pos="709"/>
-          <w:tab w:val="left" w:pos="709" w:leader="none"/>
-        </w:tabs>
-        <w:bidi w:val="0"/>
-        <w:ind w:hanging="283" w:start="709"/>
-        <w:jc w:val="start"/>
-        <w:rPr/>
-      </w:pPr>
-      <w:r>
-        <w:rPr/>
+          <w:tab w:val="left" w:pos="709"/>
+        </w:tabs>
+        <w:ind w:left="709" w:hanging="283"/>
+        <w:jc w:val="start"/>
+      </w:pPr>
+      <w:r>
+        <w:rPr>
+          <w:rFonts w:ascii="Liberation Serif" w:hAnsi="Liberation Serif" w:eastAsia="Songti SC" w:cs="Arial Unicode MS"/>
+          <w:kern w:val="2"/>
+          <w:sz w:val="24"/>
+          <w:szCs w:val="24"/>
+        </w:rPr>
         <w:t>Text</w:t>
       </w:r>
     </w:p>
@@ -579,15 +677,18 @@
         </w:numPr>
         <w:tabs>
           <w:tab w:val="clear" w:pos="709"/>
-          <w:tab w:val="left" w:pos="709" w:leader="none"/>
-        </w:tabs>
-        <w:bidi w:val="0"/>
-        <w:ind w:hanging="283" w:start="709"/>
-        <w:jc w:val="start"/>
-        <w:rPr/>
-      </w:pPr>
-      <w:r>
-        <w:rPr/>
+          <w:tab w:val="left" w:pos="709"/>
+        </w:tabs>
+        <w:ind w:left="709" w:hanging="283"/>
+        <w:jc w:val="start"/>
+      </w:pPr>
+      <w:r>
+        <w:rPr>
+          <w:rFonts w:ascii="Liberation Serif" w:hAnsi="Liberation Serif" w:eastAsia="Songti SC" w:cs="Arial Unicode MS"/>
+          <w:kern w:val="2"/>
+          <w:sz w:val="24"/>
+          <w:szCs w:val="24"/>
+        </w:rPr>
         <w:t>Images</w:t>
       </w:r>
     </w:p>
@@ -600,15 +701,18 @@
         </w:numPr>
         <w:tabs>
           <w:tab w:val="clear" w:pos="709"/>
-          <w:tab w:val="left" w:pos="709" w:leader="none"/>
-        </w:tabs>
-        <w:bidi w:val="0"/>
-        <w:ind w:hanging="283" w:start="709"/>
-        <w:jc w:val="start"/>
-        <w:rPr/>
-      </w:pPr>
-      <w:r>
-        <w:rPr/>
+          <w:tab w:val="left" w:pos="709"/>
+        </w:tabs>
+        <w:ind w:left="709" w:hanging="283"/>
+        <w:jc w:val="start"/>
+      </w:pPr>
+      <w:r>
+        <w:rPr>
+          <w:rFonts w:ascii="Liberation Serif" w:hAnsi="Liberation Serif" w:eastAsia="Songti SC" w:cs="Arial Unicode MS"/>
+          <w:kern w:val="2"/>
+          <w:sz w:val="24"/>
+          <w:szCs w:val="24"/>
+        </w:rPr>
         <w:t>Audio</w:t>
       </w:r>
     </w:p>
@@ -621,15 +725,18 @@
         </w:numPr>
         <w:tabs>
           <w:tab w:val="clear" w:pos="709"/>
-          <w:tab w:val="left" w:pos="709" w:leader="none"/>
-        </w:tabs>
-        <w:bidi w:val="0"/>
-        <w:ind w:hanging="283" w:start="709"/>
-        <w:jc w:val="start"/>
-        <w:rPr/>
-      </w:pPr>
-      <w:r>
-        <w:rPr/>
+          <w:tab w:val="left" w:pos="709"/>
+        </w:tabs>
+        <w:ind w:left="709" w:hanging="283"/>
+        <w:jc w:val="start"/>
+      </w:pPr>
+      <w:r>
+        <w:rPr>
+          <w:rFonts w:ascii="Liberation Serif" w:hAnsi="Liberation Serif" w:eastAsia="Songti SC" w:cs="Arial Unicode MS"/>
+          <w:kern w:val="2"/>
+          <w:sz w:val="24"/>
+          <w:szCs w:val="24"/>
+        </w:rPr>
         <w:t>Video</w:t>
       </w:r>
     </w:p>
@@ -642,27 +749,33 @@
         </w:numPr>
         <w:tabs>
           <w:tab w:val="clear" w:pos="709"/>
-          <w:tab w:val="left" w:pos="709" w:leader="none"/>
-        </w:tabs>
-        <w:bidi w:val="0"/>
-        <w:ind w:hanging="283" w:start="709"/>
-        <w:jc w:val="start"/>
-        <w:rPr/>
-      </w:pPr>
-      <w:r>
-        <w:rPr/>
+          <w:tab w:val="left" w:pos="709"/>
+        </w:tabs>
+        <w:ind w:left="709" w:hanging="283"/>
+        <w:jc w:val="start"/>
+      </w:pPr>
+      <w:r>
+        <w:rPr>
+          <w:rFonts w:ascii="Liberation Serif" w:hAnsi="Liberation Serif" w:eastAsia="Songti SC" w:cs="Arial Unicode MS"/>
+          <w:kern w:val="2"/>
+          <w:sz w:val="24"/>
+          <w:szCs w:val="24"/>
+        </w:rPr>
         <w:t>Code</w:t>
       </w:r>
     </w:p>
     <w:p>
       <w:pPr>
         <w:pStyle w:val="BodyText"/>
-        <w:bidi w:val="0"/>
-        <w:jc w:val="start"/>
-        <w:rPr/>
-      </w:pPr>
-      <w:r>
-        <w:rPr/>
+        <w:jc w:val="start"/>
+      </w:pPr>
+      <w:r>
+        <w:rPr>
+          <w:rFonts w:ascii="Liberation Serif" w:hAnsi="Liberation Serif" w:eastAsia="Songti SC" w:cs="Arial Unicode MS"/>
+          <w:kern w:val="2"/>
+          <w:sz w:val="24"/>
+          <w:szCs w:val="24"/>
+        </w:rPr>
         <w:t>Examples include:</w:t>
       </w:r>
     </w:p>
@@ -675,15 +788,18 @@
         </w:numPr>
         <w:tabs>
           <w:tab w:val="clear" w:pos="709"/>
-          <w:tab w:val="left" w:pos="709" w:leader="none"/>
-        </w:tabs>
-        <w:bidi w:val="0"/>
-        <w:ind w:hanging="283" w:start="709"/>
-        <w:jc w:val="start"/>
-        <w:rPr/>
-      </w:pPr>
-      <w:r>
-        <w:rPr/>
+          <w:tab w:val="left" w:pos="709"/>
+        </w:tabs>
+        <w:ind w:left="709" w:hanging="283"/>
+        <w:jc w:val="start"/>
+      </w:pPr>
+      <w:r>
+        <w:rPr>
+          <w:rFonts w:ascii="Liberation Serif" w:hAnsi="Liberation Serif" w:eastAsia="Songti SC" w:cs="Arial Unicode MS"/>
+          <w:kern w:val="2"/>
+          <w:sz w:val="24"/>
+          <w:szCs w:val="24"/>
+        </w:rPr>
         <w:t>ChatGPT</w:t>
       </w:r>
     </w:p>
@@ -696,15 +812,18 @@
         </w:numPr>
         <w:tabs>
           <w:tab w:val="clear" w:pos="709"/>
-          <w:tab w:val="left" w:pos="709" w:leader="none"/>
-        </w:tabs>
-        <w:bidi w:val="0"/>
-        <w:ind w:hanging="283" w:start="709"/>
-        <w:jc w:val="start"/>
-        <w:rPr/>
-      </w:pPr>
-      <w:r>
-        <w:rPr/>
+          <w:tab w:val="left" w:pos="709"/>
+        </w:tabs>
+        <w:ind w:left="709" w:hanging="283"/>
+        <w:jc w:val="start"/>
+      </w:pPr>
+      <w:r>
+        <w:rPr>
+          <w:rFonts w:ascii="Liberation Serif" w:hAnsi="Liberation Serif" w:eastAsia="Songti SC" w:cs="Arial Unicode MS"/>
+          <w:kern w:val="2"/>
+          <w:sz w:val="24"/>
+          <w:szCs w:val="24"/>
+        </w:rPr>
         <w:t>Claude</w:t>
       </w:r>
     </w:p>
@@ -717,15 +836,18 @@
         </w:numPr>
         <w:tabs>
           <w:tab w:val="clear" w:pos="709"/>
-          <w:tab w:val="left" w:pos="709" w:leader="none"/>
-        </w:tabs>
-        <w:bidi w:val="0"/>
-        <w:ind w:hanging="283" w:start="709"/>
-        <w:jc w:val="start"/>
-        <w:rPr/>
-      </w:pPr>
-      <w:r>
-        <w:rPr/>
+          <w:tab w:val="left" w:pos="709"/>
+        </w:tabs>
+        <w:ind w:left="709" w:hanging="283"/>
+        <w:jc w:val="start"/>
+      </w:pPr>
+      <w:r>
+        <w:rPr>
+          <w:rFonts w:ascii="Liberation Serif" w:hAnsi="Liberation Serif" w:eastAsia="Songti SC" w:cs="Arial Unicode MS"/>
+          <w:kern w:val="2"/>
+          <w:sz w:val="24"/>
+          <w:szCs w:val="24"/>
+        </w:rPr>
         <w:t>Amazon Nova</w:t>
       </w:r>
     </w:p>
@@ -738,224 +860,276 @@
         </w:numPr>
         <w:tabs>
           <w:tab w:val="clear" w:pos="709"/>
-          <w:tab w:val="left" w:pos="709" w:leader="none"/>
-        </w:tabs>
-        <w:bidi w:val="0"/>
-        <w:ind w:hanging="283" w:start="709"/>
-        <w:jc w:val="start"/>
-        <w:rPr/>
-      </w:pPr>
-      <w:r>
-        <w:rPr/>
+          <w:tab w:val="left" w:pos="709"/>
+        </w:tabs>
+        <w:ind w:left="709" w:hanging="283"/>
+        <w:jc w:val="start"/>
+      </w:pPr>
+      <w:r>
+        <w:rPr>
+          <w:rFonts w:ascii="Liberation Serif" w:hAnsi="Liberation Serif" w:eastAsia="Songti SC" w:cs="Arial Unicode MS"/>
+          <w:kern w:val="2"/>
+          <w:sz w:val="24"/>
+          <w:szCs w:val="24"/>
+        </w:rPr>
         <w:t>Gemini</w:t>
       </w:r>
     </w:p>
     <w:p>
       <w:pPr>
         <w:pStyle w:val="BodyText"/>
-        <w:bidi w:val="0"/>
-        <w:jc w:val="start"/>
-        <w:rPr/>
-      </w:pPr>
-      <w:r>
-        <w:rPr/>
+        <w:jc w:val="start"/>
+      </w:pPr>
+      <w:r>
+        <w:rPr>
+          <w:rFonts w:ascii="Liberation Serif" w:hAnsi="Liberation Serif" w:eastAsia="Songti SC" w:cs="Arial Unicode MS"/>
+          <w:kern w:val="2"/>
+          <w:sz w:val="24"/>
+          <w:szCs w:val="24"/>
+        </w:rPr>
         <w:t>When you ask:</w:t>
       </w:r>
     </w:p>
     <w:p>
       <w:pPr>
         <w:pStyle w:val="BodyText"/>
-        <w:bidi w:val="0"/>
-        <w:jc w:val="start"/>
-        <w:rPr/>
-      </w:pPr>
-      <w:r>
-        <w:rPr/>
+        <w:jc w:val="start"/>
+      </w:pPr>
+      <w:r>
+        <w:rPr>
+          <w:rFonts w:ascii="Liberation Serif" w:hAnsi="Liberation Serif" w:eastAsia="Songti SC" w:cs="Arial Unicode MS"/>
+          <w:kern w:val="2"/>
+          <w:sz w:val="24"/>
+          <w:szCs w:val="24"/>
+        </w:rPr>
         <w:t>"Write a friendly Airbnb reply for a customer looking for a staycation."</w:t>
       </w:r>
     </w:p>
     <w:p>
       <w:pPr>
         <w:pStyle w:val="BodyText"/>
-        <w:bidi w:val="0"/>
-        <w:jc w:val="start"/>
-        <w:rPr/>
-      </w:pPr>
-      <w:r>
-        <w:rPr/>
+        <w:jc w:val="start"/>
+      </w:pPr>
+      <w:r>
+        <w:rPr>
+          <w:rFonts w:ascii="Liberation Serif" w:hAnsi="Liberation Serif" w:eastAsia="Songti SC" w:cs="Arial Unicode MS"/>
+          <w:kern w:val="2"/>
+          <w:sz w:val="24"/>
+          <w:szCs w:val="24"/>
+        </w:rPr>
         <w:t>the model generates text based on patterns learned from enormous amounts of training data.</w:t>
       </w:r>
     </w:p>
     <w:p>
       <w:pPr>
         <w:pStyle w:val="BodyText"/>
-        <w:bidi w:val="0"/>
-        <w:jc w:val="start"/>
-        <w:rPr/>
-      </w:pPr>
-      <w:r>
-        <w:rPr/>
+        <w:jc w:val="start"/>
+      </w:pPr>
+      <w:r>
+        <w:rPr>
+          <w:rFonts w:ascii="Liberation Serif" w:hAnsi="Liberation Serif" w:eastAsia="Songti SC" w:cs="Arial Unicode MS"/>
+          <w:kern w:val="2"/>
+          <w:sz w:val="24"/>
+          <w:szCs w:val="24"/>
+        </w:rPr>
         <w:t>Think of it as a brilliant writer.</w:t>
       </w:r>
     </w:p>
     <w:p>
       <w:pPr>
         <w:pStyle w:val="BodyText"/>
-        <w:bidi w:val="0"/>
-        <w:jc w:val="start"/>
-        <w:rPr/>
-      </w:pPr>
-      <w:r>
-        <w:rPr/>
+        <w:jc w:val="start"/>
+      </w:pPr>
+      <w:r>
+        <w:rPr>
+          <w:rFonts w:ascii="Liberation Serif" w:hAnsi="Liberation Serif" w:eastAsia="Songti SC" w:cs="Arial Unicode MS"/>
+          <w:kern w:val="2"/>
+          <w:sz w:val="24"/>
+          <w:szCs w:val="24"/>
+        </w:rPr>
         <w:t>It knows language extremely well.</w:t>
       </w:r>
     </w:p>
     <w:p>
       <w:pPr>
         <w:pStyle w:val="BodyText"/>
-        <w:bidi w:val="0"/>
-        <w:jc w:val="start"/>
-        <w:rPr/>
-      </w:pPr>
-      <w:r>
-        <w:rPr/>
+        <w:jc w:val="start"/>
+      </w:pPr>
+      <w:r>
+        <w:rPr>
+          <w:rFonts w:ascii="Liberation Serif" w:hAnsi="Liberation Serif" w:eastAsia="Songti SC" w:cs="Arial Unicode MS"/>
+          <w:kern w:val="2"/>
+          <w:sz w:val="24"/>
+          <w:szCs w:val="24"/>
+        </w:rPr>
         <w:t>It does not automatically know your calendar, your Facebook groups, or your business rules.</w:t>
       </w:r>
     </w:p>
     <w:p>
       <w:pPr>
         <w:pStyle w:val="Heading3"/>
-        <w:bidi w:val="0"/>
-        <w:jc w:val="start"/>
-        <w:rPr/>
-      </w:pPr>
-      <w:r>
-        <w:rPr/>
+        <w:jc w:val="start"/>
+      </w:pPr>
+      <w:r>
+        <w:rPr>
+          <w:rFonts w:ascii="Liberation Serif" w:hAnsi="Liberation Serif" w:eastAsia="Songti SC" w:cs="Arial Unicode MS"/>
+          <w:b/>
+          <w:bCs/>
+          <w:kern w:val="2"/>
+          <w:sz w:val="28"/>
+          <w:szCs w:val="28"/>
+        </w:rPr>
         <w:t>1.3 Why a Chatbot Is Not Enough</w:t>
       </w:r>
     </w:p>
     <w:p>
       <w:pPr>
         <w:pStyle w:val="BodyText"/>
-        <w:bidi w:val="0"/>
-        <w:jc w:val="start"/>
-        <w:rPr/>
-      </w:pPr>
-      <w:r>
-        <w:rPr/>
+        <w:jc w:val="start"/>
+      </w:pPr>
+      <w:r>
+        <w:rPr>
+          <w:rFonts w:ascii="Liberation Serif" w:hAnsi="Liberation Serif" w:eastAsia="Songti SC" w:cs="Arial Unicode MS"/>
+          <w:kern w:val="2"/>
+          <w:sz w:val="24"/>
+          <w:szCs w:val="24"/>
+        </w:rPr>
         <w:t>Suppose a Facebook user posts:</w:t>
       </w:r>
     </w:p>
     <w:p>
       <w:pPr>
         <w:pStyle w:val="BodyText"/>
-        <w:bidi w:val="0"/>
-        <w:jc w:val="start"/>
-        <w:rPr/>
-      </w:pPr>
-      <w:r>
-        <w:rPr/>
+        <w:jc w:val="start"/>
+      </w:pPr>
+      <w:r>
+        <w:rPr>
+          <w:rFonts w:ascii="Liberation Serif" w:hAnsi="Liberation Serif" w:eastAsia="Songti SC" w:cs="Arial Unicode MS"/>
+          <w:kern w:val="2"/>
+          <w:sz w:val="24"/>
+          <w:szCs w:val="24"/>
+        </w:rPr>
         <w:t>"Looking for accommodation for 6 adults this July 20–22 near Tagaytay."</w:t>
       </w:r>
     </w:p>
     <w:p>
       <w:pPr>
         <w:pStyle w:val="BodyText"/>
-        <w:bidi w:val="0"/>
-        <w:jc w:val="start"/>
-        <w:rPr/>
-      </w:pPr>
-      <w:r>
-        <w:rPr/>
+        <w:jc w:val="start"/>
+      </w:pPr>
+      <w:r>
+        <w:rPr>
+          <w:rFonts w:ascii="Liberation Serif" w:hAnsi="Liberation Serif" w:eastAsia="Songti SC" w:cs="Arial Unicode MS"/>
+          <w:kern w:val="2"/>
+          <w:sz w:val="24"/>
+          <w:szCs w:val="24"/>
+        </w:rPr>
         <w:t>A normal chatbot can produce a nice sentence such as:</w:t>
       </w:r>
     </w:p>
     <w:p>
       <w:pPr>
         <w:pStyle w:val="BodyText"/>
-        <w:bidi w:val="0"/>
-        <w:jc w:val="start"/>
-        <w:rPr/>
-      </w:pPr>
-      <w:r>
-        <w:rPr/>
+        <w:jc w:val="start"/>
+      </w:pPr>
+      <w:r>
+        <w:rPr>
+          <w:rFonts w:ascii="Liberation Serif" w:hAnsi="Liberation Serif" w:eastAsia="Songti SC" w:cs="Arial Unicode MS"/>
+          <w:kern w:val="2"/>
+          <w:sz w:val="24"/>
+          <w:szCs w:val="24"/>
+        </w:rPr>
         <w:t>"Our Airbnb may be suitable for your group of six guests."</w:t>
       </w:r>
     </w:p>
     <w:p>
       <w:pPr>
         <w:pStyle w:val="BodyText"/>
-        <w:bidi w:val="0"/>
-        <w:jc w:val="start"/>
-        <w:rPr/>
-      </w:pPr>
-      <w:r>
-        <w:rPr/>
+        <w:jc w:val="start"/>
+      </w:pPr>
+      <w:r>
+        <w:rPr>
+          <w:rFonts w:ascii="Liberation Serif" w:hAnsi="Liberation Serif" w:eastAsia="Songti SC" w:cs="Arial Unicode MS"/>
+          <w:kern w:val="2"/>
+          <w:sz w:val="24"/>
+          <w:szCs w:val="24"/>
+        </w:rPr>
         <w:t>But it cannot answer the most important business question:</w:t>
       </w:r>
     </w:p>
     <w:p>
       <w:pPr>
         <w:pStyle w:val="BodyText"/>
-        <w:bidi w:val="0"/>
-        <w:jc w:val="start"/>
-        <w:rPr/>
-      </w:pPr>
-      <w:r>
-        <w:rPr/>
+        <w:jc w:val="start"/>
+      </w:pPr>
+      <w:r>
+        <w:rPr>
+          <w:rFonts w:ascii="Liberation Serif" w:hAnsi="Liberation Serif" w:eastAsia="Songti SC" w:cs="Arial Unicode MS"/>
+          <w:kern w:val="2"/>
+          <w:sz w:val="24"/>
+          <w:szCs w:val="24"/>
+        </w:rPr>
         <w:t>"Are those dates actually available?"</w:t>
       </w:r>
     </w:p>
     <w:p>
       <w:pPr>
         <w:pStyle w:val="BodyText"/>
-        <w:bidi w:val="0"/>
-        <w:jc w:val="start"/>
-        <w:rPr/>
-      </w:pPr>
-      <w:r>
-        <w:rPr/>
+        <w:jc w:val="start"/>
+      </w:pPr>
+      <w:r>
+        <w:rPr>
+          <w:rFonts w:ascii="Liberation Serif" w:hAnsi="Liberation Serif" w:eastAsia="Songti SC" w:cs="Arial Unicode MS"/>
+          <w:kern w:val="2"/>
+          <w:sz w:val="24"/>
+          <w:szCs w:val="24"/>
+        </w:rPr>
         <w:t>To answer that, the system must interact with the real world.</w:t>
       </w:r>
     </w:p>
     <w:p>
       <w:pPr>
         <w:pStyle w:val="Heading3"/>
-        <w:bidi w:val="0"/>
-        <w:jc w:val="start"/>
-        <w:rPr/>
-      </w:pPr>
-      <w:r>
-        <w:rPr/>
+        <w:jc w:val="start"/>
+      </w:pPr>
+      <w:r>
+        <w:rPr>
+          <w:rFonts w:ascii="Liberation Serif" w:hAnsi="Liberation Serif" w:eastAsia="Songti SC" w:cs="Arial Unicode MS"/>
+          <w:b/>
+          <w:bCs/>
+          <w:kern w:val="2"/>
+          <w:sz w:val="28"/>
+          <w:szCs w:val="28"/>
+        </w:rPr>
         <w:t>1.4 The Missing Ingredient: Actions</w:t>
       </w:r>
     </w:p>
     <w:p>
       <w:pPr>
         <w:pStyle w:val="BodyText"/>
-        <w:bidi w:val="0"/>
-        <w:jc w:val="start"/>
-        <w:rPr/>
-      </w:pPr>
-      <w:r>
-        <w:rPr/>
+        <w:jc w:val="start"/>
+      </w:pPr>
+      <w:r>
+        <w:rPr>
+          <w:rFonts w:ascii="Liberation Serif" w:hAnsi="Liberation Serif" w:eastAsia="Songti SC" w:cs="Arial Unicode MS"/>
+          <w:kern w:val="2"/>
+          <w:sz w:val="24"/>
+          <w:szCs w:val="24"/>
+        </w:rPr>
         <w:t>An AI becomes agentic when it can perform actions.</w:t>
       </w:r>
     </w:p>
     <w:p>
       <w:pPr>
         <w:pStyle w:val="BodyText"/>
-        <w:bidi w:val="0"/>
-        <w:jc w:val="start"/>
-        <w:rPr/>
-      </w:pPr>
-      <w:r>
-        <w:rPr/>
+        <w:jc w:val="start"/>
+      </w:pPr>
+      <w:r>
         <w:drawing>
           <wp:inline distT="0" distB="0" distL="0" distR="0">
-            <wp:extent cx="4235450" cy="2830830"/>
+            <wp:extent cx="4238625" cy="2828925"/>
             <wp:effectExtent l="0" t="0" r="0" b="0"/>
-            <wp:docPr id="1" name="Image1" title="How to Master Gen AI: Volume 3— Agentic AI (Part 1: Foundations) | by Martin Jurado Pedroza | Apr, 2026 | Medium"/>
+            <wp:docPr id="100000" name="How to Master Gen AI: Volume 3— Agentic AI (Part 1: Foundations) | by Martin Jurado Pedroza | Apr, 2026 | Medium"/>
             <wp:cNvGraphicFramePr>
               <a:graphicFrameLocks xmlns:a="http://schemas.openxmlformats.org/drawingml/2006/main" noChangeAspect="1"/>
             </wp:cNvGraphicFramePr>
@@ -963,26 +1137,23 @@
               <a:graphicData uri="http://schemas.openxmlformats.org/drawingml/2006/picture">
                 <pic:pic xmlns:pic="http://schemas.openxmlformats.org/drawingml/2006/picture">
                   <pic:nvPicPr>
-                    <pic:cNvPr id="1" name="Image1" title="How to Master Gen AI: Volume 3— Agentic AI (Part 1: Foundations) | by Martin Jurado Pedroza | Apr, 2026 | Medium"/>
-                    <pic:cNvPicPr>
-                      <a:picLocks noChangeAspect="1" noChangeArrowheads="1"/>
-                    </pic:cNvPicPr>
+                    <pic:cNvPr id="100000" name="image100000"/>
+                    <pic:cNvPicPr/>
                   </pic:nvPicPr>
                   <pic:blipFill>
-                    <a:blip r:embed="rId2"/>
+                    <a:blip r:embed="rId8"/>
                     <a:stretch>
                       <a:fillRect/>
                     </a:stretch>
                   </pic:blipFill>
-                  <pic:spPr bwMode="auto">
+                  <pic:spPr>
                     <a:xfrm>
                       <a:off x="0" y="0"/>
-                      <a:ext cx="4235450" cy="2830830"/>
+                      <a:ext cx="4238625" cy="2828925"/>
                     </a:xfrm>
                     <a:prstGeom prst="rect">
                       <a:avLst/>
                     </a:prstGeom>
-                    <a:noFill/>
                   </pic:spPr>
                 </pic:pic>
               </a:graphicData>
@@ -994,485 +1165,619 @@
     <w:p>
       <w:pPr>
         <w:pStyle w:val="BodyText"/>
-        <w:bidi w:val="0"/>
-        <w:jc w:val="start"/>
-        <w:rPr/>
-      </w:pPr>
-      <w:r>
-        <w:rPr/>
+        <w:jc w:val="start"/>
+      </w:pPr>
+      <w:r>
+        <w:rPr>
+          <w:rFonts w:ascii="Liberation Serif" w:hAnsi="Liberation Serif" w:eastAsia="Songti SC" w:cs="Arial Unicode MS"/>
+          <w:kern w:val="2"/>
+          <w:sz w:val="24"/>
+          <w:szCs w:val="24"/>
+        </w:rPr>
         <w:t>For our project, the agent must be able to:</w:t>
       </w:r>
     </w:p>
     <w:p>
       <w:pPr>
         <w:pStyle w:val="BodyText"/>
-        <w:bidi w:val="0"/>
-        <w:jc w:val="start"/>
-        <w:rPr/>
-      </w:pPr>
-      <w:r>
-        <w:rPr/>
+        <w:jc w:val="start"/>
+      </w:pPr>
+      <w:r>
+        <w:rPr>
+          <w:rFonts w:ascii="Liberation Serif" w:hAnsi="Liberation Serif" w:eastAsia="Songti SC" w:cs="Arial Unicode MS"/>
+          <w:b/>
+          <w:bCs/>
+          <w:kern w:val="2"/>
+          <w:sz w:val="24"/>
+          <w:szCs w:val="24"/>
+        </w:rPr>
         <w:t>Understand</w:t>
       </w:r>
     </w:p>
     <w:p>
       <w:pPr>
         <w:pStyle w:val="BodyText"/>
-        <w:bidi w:val="0"/>
-        <w:jc w:val="start"/>
-        <w:rPr/>
-      </w:pPr>
-      <w:r>
-        <w:rPr/>
-        <w:t>Read the post</w:t>
-      </w:r>
-    </w:p>
-    <w:p>
-      <w:pPr>
-        <w:pStyle w:val="BodyText"/>
-        <w:bidi w:val="0"/>
-        <w:jc w:val="start"/>
-        <w:rPr/>
-      </w:pPr>
-      <w:r>
-        <w:rPr/>
+        <w:jc w:val="start"/>
+      </w:pPr>
+      <w:r>
+        <w:rPr>
+          <w:rFonts w:ascii="Liberation Serif" w:hAnsi="Liberation Serif" w:eastAsia="Songti SC" w:cs="Arial Unicode MS"/>
+          <w:kern w:val="2"/>
+          <w:sz w:val="24"/>
+          <w:szCs w:val="24"/>
+        </w:rPr>
+        <w:t xml:space="preserve">   Read the post</w:t>
+      </w:r>
+    </w:p>
+    <w:p>
+      <w:pPr>
+        <w:pStyle w:val="BodyText"/>
+        <w:jc w:val="start"/>
+      </w:pPr>
+      <w:r>
+        <w:rPr>
+          <w:rFonts w:ascii="Liberation Serif" w:hAnsi="Liberation Serif" w:eastAsia="Songti SC" w:cs="Arial Unicode MS"/>
+          <w:b/>
+          <w:bCs/>
+          <w:kern w:val="2"/>
+          <w:sz w:val="24"/>
+          <w:szCs w:val="24"/>
+        </w:rPr>
         <w:t>Think</w:t>
       </w:r>
     </w:p>
     <w:p>
       <w:pPr>
         <w:pStyle w:val="BodyText"/>
-        <w:bidi w:val="0"/>
-        <w:jc w:val="start"/>
-        <w:rPr/>
-      </w:pPr>
-      <w:r>
-        <w:rPr/>
-        <w:t>Extract guests &amp; dates</w:t>
-      </w:r>
-    </w:p>
-    <w:p>
-      <w:pPr>
-        <w:pStyle w:val="BodyText"/>
-        <w:bidi w:val="0"/>
-        <w:jc w:val="start"/>
-        <w:rPr/>
-      </w:pPr>
-      <w:r>
-        <w:rPr/>
+        <w:jc w:val="start"/>
+      </w:pPr>
+      <w:r>
+        <w:rPr>
+          <w:rFonts w:ascii="Liberation Serif" w:hAnsi="Liberation Serif" w:eastAsia="Songti SC" w:cs="Arial Unicode MS"/>
+          <w:kern w:val="2"/>
+          <w:sz w:val="24"/>
+          <w:szCs w:val="24"/>
+        </w:rPr>
+        <w:t xml:space="preserve">   Extract guests &amp; dates</w:t>
+      </w:r>
+    </w:p>
+    <w:p>
+      <w:pPr>
+        <w:pStyle w:val="BodyText"/>
+        <w:jc w:val="start"/>
+      </w:pPr>
+      <w:r>
+        <w:rPr>
+          <w:rFonts w:ascii="Liberation Serif" w:hAnsi="Liberation Serif" w:eastAsia="Songti SC" w:cs="Arial Unicode MS"/>
+          <w:b/>
+          <w:bCs/>
+          <w:kern w:val="2"/>
+          <w:sz w:val="24"/>
+          <w:szCs w:val="24"/>
+        </w:rPr>
         <w:t>Use Tools</w:t>
       </w:r>
     </w:p>
     <w:p>
       <w:pPr>
         <w:pStyle w:val="BodyText"/>
-        <w:bidi w:val="0"/>
-        <w:jc w:val="start"/>
-        <w:rPr/>
-      </w:pPr>
-      <w:r>
-        <w:rPr/>
-        <w:t>Check calendar</w:t>
-      </w:r>
-    </w:p>
-    <w:p>
-      <w:pPr>
-        <w:pStyle w:val="BodyText"/>
-        <w:bidi w:val="0"/>
-        <w:jc w:val="start"/>
-        <w:rPr/>
-      </w:pPr>
-      <w:r>
-        <w:rPr/>
+        <w:jc w:val="start"/>
+      </w:pPr>
+      <w:r>
+        <w:rPr>
+          <w:rFonts w:ascii="Liberation Serif" w:hAnsi="Liberation Serif" w:eastAsia="Songti SC" w:cs="Arial Unicode MS"/>
+          <w:kern w:val="2"/>
+          <w:sz w:val="24"/>
+          <w:szCs w:val="24"/>
+        </w:rPr>
+        <w:t xml:space="preserve">    Check calendar</w:t>
+      </w:r>
+    </w:p>
+    <w:p>
+      <w:pPr>
+        <w:pStyle w:val="BodyText"/>
+        <w:jc w:val="start"/>
+      </w:pPr>
+      <w:r>
+        <w:rPr>
+          <w:rFonts w:ascii="Liberation Serif" w:hAnsi="Liberation Serif" w:eastAsia="Songti SC" w:cs="Arial Unicode MS"/>
+          <w:b/>
+          <w:bCs/>
+          <w:kern w:val="2"/>
+          <w:sz w:val="24"/>
+          <w:szCs w:val="24"/>
+        </w:rPr>
         <w:t>Act</w:t>
       </w:r>
     </w:p>
     <w:p>
       <w:pPr>
         <w:pStyle w:val="BodyText"/>
-        <w:bidi w:val="0"/>
-        <w:jc w:val="start"/>
-        <w:rPr/>
-      </w:pPr>
-      <w:r>
-        <w:rPr/>
-        <w:t>Reply on Facebook</w:t>
-      </w:r>
-    </w:p>
-    <w:p>
-      <w:pPr>
-        <w:pStyle w:val="BodyText"/>
-        <w:bidi w:val="0"/>
-        <w:jc w:val="start"/>
-        <w:rPr/>
-      </w:pPr>
-      <w:r>
-        <w:rPr/>
+        <w:jc w:val="start"/>
+      </w:pPr>
+      <w:r>
+        <w:rPr>
+          <w:rFonts w:ascii="Liberation Serif" w:hAnsi="Liberation Serif" w:eastAsia="Songti SC" w:cs="Arial Unicode MS"/>
+          <w:kern w:val="2"/>
+          <w:sz w:val="24"/>
+          <w:szCs w:val="24"/>
+        </w:rPr>
+        <w:t xml:space="preserve">    Reply on Facebook</w:t>
+      </w:r>
+    </w:p>
+    <w:p>
+      <w:pPr>
+        <w:pStyle w:val="BodyText"/>
+        <w:jc w:val="start"/>
+      </w:pPr>
+      <w:r>
+        <w:rPr>
+          <w:rFonts w:ascii="Liberation Serif" w:hAnsi="Liberation Serif" w:eastAsia="Songti SC" w:cs="Arial Unicode MS"/>
+          <w:kern w:val="2"/>
+          <w:sz w:val="24"/>
+          <w:szCs w:val="24"/>
+        </w:rPr>
         <w:t>These four capabilities are the core of nearly every modern AI agent system.</w:t>
       </w:r>
     </w:p>
     <w:p>
       <w:pPr>
         <w:pStyle w:val="Heading3"/>
-        <w:bidi w:val="0"/>
-        <w:jc w:val="start"/>
-        <w:rPr/>
-      </w:pPr>
-      <w:r>
-        <w:rPr/>
+        <w:jc w:val="start"/>
+      </w:pPr>
+      <w:r>
+        <w:rPr>
+          <w:rFonts w:ascii="Liberation Serif" w:hAnsi="Liberation Serif" w:eastAsia="Songti SC" w:cs="Arial Unicode MS"/>
+          <w:b/>
+          <w:bCs/>
+          <w:kern w:val="2"/>
+          <w:sz w:val="28"/>
+          <w:szCs w:val="28"/>
+        </w:rPr>
         <w:t>1.5 The Four Agent Superpowers</w:t>
       </w:r>
     </w:p>
     <w:p>
       <w:pPr>
         <w:pStyle w:val="Heading3"/>
-        <w:bidi w:val="0"/>
-        <w:jc w:val="start"/>
-        <w:rPr/>
-      </w:pPr>
-      <w:r>
-        <w:rPr/>
+        <w:jc w:val="start"/>
+      </w:pPr>
+      <w:r>
+        <w:rPr>
+          <w:rFonts w:ascii="Liberation Serif" w:hAnsi="Liberation Serif" w:eastAsia="Songti SC" w:cs="Arial Unicode MS"/>
+          <w:b/>
+          <w:bCs/>
+          <w:kern w:val="2"/>
+          <w:sz w:val="28"/>
+          <w:szCs w:val="28"/>
+        </w:rPr>
         <w:t>Superpower #1 — Understand</w:t>
       </w:r>
     </w:p>
     <w:p>
       <w:pPr>
         <w:pStyle w:val="BodyText"/>
-        <w:bidi w:val="0"/>
-        <w:jc w:val="start"/>
-        <w:rPr/>
-      </w:pPr>
-      <w:r>
-        <w:rPr/>
+        <w:jc w:val="start"/>
+      </w:pPr>
+      <w:r>
+        <w:rPr>
+          <w:rFonts w:ascii="Liberation Serif" w:hAnsi="Liberation Serif" w:eastAsia="Songti SC" w:cs="Arial Unicode MS"/>
+          <w:kern w:val="2"/>
+          <w:sz w:val="24"/>
+          <w:szCs w:val="24"/>
+        </w:rPr>
         <w:t>Input:</w:t>
       </w:r>
     </w:p>
     <w:p>
       <w:pPr>
         <w:pStyle w:val="BodyText"/>
-        <w:bidi w:val="0"/>
-        <w:jc w:val="start"/>
-        <w:rPr/>
-      </w:pPr>
-      <w:r>
-        <w:rPr/>
+        <w:jc w:val="start"/>
+      </w:pPr>
+      <w:r>
+        <w:rPr>
+          <w:rFonts w:ascii="Liberation Serif" w:hAnsi="Liberation Serif" w:eastAsia="Songti SC" w:cs="Arial Unicode MS"/>
+          <w:kern w:val="2"/>
+          <w:sz w:val="24"/>
+          <w:szCs w:val="24"/>
+        </w:rPr>
         <w:t>"Need a staycation for 7 adults this weekend."</w:t>
       </w:r>
     </w:p>
     <w:p>
       <w:pPr>
         <w:pStyle w:val="BodyText"/>
-        <w:bidi w:val="0"/>
-        <w:jc w:val="start"/>
-        <w:rPr/>
-      </w:pPr>
-      <w:r>
-        <w:rPr/>
+        <w:jc w:val="start"/>
+      </w:pPr>
+      <w:r>
+        <w:rPr>
+          <w:rFonts w:ascii="Liberation Serif" w:hAnsi="Liberation Serif" w:eastAsia="Songti SC" w:cs="Arial Unicode MS"/>
+          <w:kern w:val="2"/>
+          <w:sz w:val="24"/>
+          <w:szCs w:val="24"/>
+        </w:rPr>
         <w:t>Extracted information:</w:t>
       </w:r>
     </w:p>
     <w:p>
       <w:pPr>
         <w:pStyle w:val="BodyText"/>
-        <w:bidi w:val="0"/>
-        <w:jc w:val="start"/>
-        <w:rPr/>
-      </w:pPr>
-      <w:r>
-        <w:rPr/>
+        <w:jc w:val="start"/>
+      </w:pPr>
+      <w:r>
+        <w:rPr>
+          <w:rFonts w:ascii="Liberation Serif" w:hAnsi="Liberation Serif" w:eastAsia="Songti SC" w:cs="Arial Unicode MS"/>
+          <w:kern w:val="2"/>
+          <w:sz w:val="24"/>
+          <w:szCs w:val="24"/>
+        </w:rPr>
         <w:t>Intent</w:t>
       </w:r>
     </w:p>
     <w:p>
       <w:pPr>
         <w:pStyle w:val="BodyText"/>
-        <w:bidi w:val="0"/>
-        <w:jc w:val="start"/>
-        <w:rPr/>
-      </w:pPr>
-      <w:r>
-        <w:rPr/>
+        <w:jc w:val="start"/>
+      </w:pPr>
+      <w:r>
+        <w:rPr>
+          <w:rFonts w:ascii="Liberation Serif" w:hAnsi="Liberation Serif" w:eastAsia="Songti SC" w:cs="Arial Unicode MS"/>
+          <w:kern w:val="2"/>
+          <w:sz w:val="24"/>
+          <w:szCs w:val="24"/>
+        </w:rPr>
         <w:t>Accommodation request</w:t>
       </w:r>
     </w:p>
     <w:p>
       <w:pPr>
         <w:pStyle w:val="BodyText"/>
-        <w:bidi w:val="0"/>
-        <w:jc w:val="start"/>
-        <w:rPr/>
-      </w:pPr>
-      <w:r>
-        <w:rPr/>
+        <w:jc w:val="start"/>
+      </w:pPr>
+      <w:r>
+        <w:rPr>
+          <w:rFonts w:ascii="Liberation Serif" w:hAnsi="Liberation Serif" w:eastAsia="Songti SC" w:cs="Arial Unicode MS"/>
+          <w:kern w:val="2"/>
+          <w:sz w:val="24"/>
+          <w:szCs w:val="24"/>
+        </w:rPr>
         <w:t>Guests</w:t>
       </w:r>
     </w:p>
     <w:p>
       <w:pPr>
         <w:pStyle w:val="BodyText"/>
-        <w:bidi w:val="0"/>
-        <w:jc w:val="start"/>
-        <w:rPr/>
-      </w:pPr>
-      <w:r>
-        <w:rPr/>
+        <w:jc w:val="start"/>
+      </w:pPr>
+      <w:r>
+        <w:rPr>
+          <w:rFonts w:ascii="Liberation Serif" w:hAnsi="Liberation Serif" w:eastAsia="Songti SC" w:cs="Arial Unicode MS"/>
+          <w:kern w:val="2"/>
+          <w:sz w:val="24"/>
+          <w:szCs w:val="24"/>
+        </w:rPr>
         <w:t>7</w:t>
       </w:r>
     </w:p>
     <w:p>
       <w:pPr>
         <w:pStyle w:val="BodyText"/>
-        <w:bidi w:val="0"/>
-        <w:jc w:val="start"/>
-        <w:rPr/>
-      </w:pPr>
-      <w:r>
-        <w:rPr/>
+        <w:jc w:val="start"/>
+      </w:pPr>
+      <w:r>
+        <w:rPr>
+          <w:rFonts w:ascii="Liberation Serif" w:hAnsi="Liberation Serif" w:eastAsia="Songti SC" w:cs="Arial Unicode MS"/>
+          <w:kern w:val="2"/>
+          <w:sz w:val="24"/>
+          <w:szCs w:val="24"/>
+        </w:rPr>
         <w:t>Dates</w:t>
       </w:r>
     </w:p>
     <w:p>
       <w:pPr>
         <w:pStyle w:val="BodyText"/>
-        <w:bidi w:val="0"/>
-        <w:jc w:val="start"/>
-        <w:rPr/>
-      </w:pPr>
-      <w:r>
-        <w:rPr/>
+        <w:jc w:val="start"/>
+      </w:pPr>
+      <w:r>
+        <w:rPr>
+          <w:rFonts w:ascii="Liberation Serif" w:hAnsi="Liberation Serif" w:eastAsia="Songti SC" w:cs="Arial Unicode MS"/>
+          <w:kern w:val="2"/>
+          <w:sz w:val="24"/>
+          <w:szCs w:val="24"/>
+        </w:rPr>
         <w:t>This weekend</w:t>
       </w:r>
     </w:p>
     <w:p>
       <w:pPr>
         <w:pStyle w:val="BodyText"/>
-        <w:bidi w:val="0"/>
-        <w:jc w:val="start"/>
-        <w:rPr/>
-      </w:pPr>
-      <w:r>
-        <w:rPr/>
+        <w:jc w:val="start"/>
+      </w:pPr>
+      <w:r>
+        <w:rPr>
+          <w:rFonts w:ascii="Liberation Serif" w:hAnsi="Liberation Serif" w:eastAsia="Songti SC" w:cs="Arial Unicode MS"/>
+          <w:kern w:val="2"/>
+          <w:sz w:val="24"/>
+          <w:szCs w:val="24"/>
+        </w:rPr>
         <w:t>Location</w:t>
       </w:r>
     </w:p>
     <w:p>
       <w:pPr>
         <w:pStyle w:val="BodyText"/>
-        <w:bidi w:val="0"/>
-        <w:jc w:val="start"/>
-        <w:rPr/>
-      </w:pPr>
-      <w:r>
-        <w:rPr/>
+        <w:jc w:val="start"/>
+      </w:pPr>
+      <w:r>
+        <w:rPr>
+          <w:rFonts w:ascii="Liberation Serif" w:hAnsi="Liberation Serif" w:eastAsia="Songti SC" w:cs="Arial Unicode MS"/>
+          <w:kern w:val="2"/>
+          <w:sz w:val="24"/>
+          <w:szCs w:val="24"/>
+        </w:rPr>
         <w:t>Not specified</w:t>
       </w:r>
     </w:p>
     <w:p>
       <w:pPr>
         <w:pStyle w:val="BodyText"/>
-        <w:bidi w:val="0"/>
-        <w:jc w:val="start"/>
-        <w:rPr/>
-      </w:pPr>
-      <w:r>
-        <w:rPr/>
+        <w:jc w:val="start"/>
+      </w:pPr>
+      <w:r>
+        <w:rPr>
+          <w:rFonts w:ascii="Liberation Serif" w:hAnsi="Liberation Serif" w:eastAsia="Songti SC" w:cs="Arial Unicode MS"/>
+          <w:kern w:val="2"/>
+          <w:sz w:val="24"/>
+          <w:szCs w:val="24"/>
+        </w:rPr>
         <w:t>This is called intent extraction.</w:t>
       </w:r>
     </w:p>
     <w:p>
       <w:pPr>
         <w:pStyle w:val="Heading3"/>
-        <w:bidi w:val="0"/>
-        <w:jc w:val="start"/>
-        <w:rPr/>
-      </w:pPr>
-      <w:r>
-        <w:rPr/>
+        <w:jc w:val="start"/>
+      </w:pPr>
+      <w:r>
+        <w:rPr>
+          <w:rFonts w:ascii="Liberation Serif" w:hAnsi="Liberation Serif" w:eastAsia="Songti SC" w:cs="Arial Unicode MS"/>
+          <w:b/>
+          <w:bCs/>
+          <w:kern w:val="2"/>
+          <w:sz w:val="28"/>
+          <w:szCs w:val="28"/>
+        </w:rPr>
         <w:t>Superpower #2 — Think</w:t>
       </w:r>
     </w:p>
     <w:p>
       <w:pPr>
         <w:pStyle w:val="BodyText"/>
-        <w:bidi w:val="0"/>
-        <w:jc w:val="start"/>
-        <w:rPr/>
-      </w:pPr>
-      <w:r>
-        <w:rPr/>
+        <w:jc w:val="start"/>
+      </w:pPr>
+      <w:r>
+        <w:rPr>
+          <w:rFonts w:ascii="Liberation Serif" w:hAnsi="Liberation Serif" w:eastAsia="Songti SC" w:cs="Arial Unicode MS"/>
+          <w:kern w:val="2"/>
+          <w:sz w:val="24"/>
+          <w:szCs w:val="24"/>
+        </w:rPr>
         <w:t>The agent reasons:</w:t>
       </w:r>
     </w:p>
     <w:p>
       <w:pPr>
         <w:pStyle w:val="BodyText"/>
-        <w:bidi w:val="0"/>
-        <w:jc w:val="start"/>
-        <w:rPr/>
-      </w:pPr>
-      <w:r>
-        <w:rPr/>
+        <w:jc w:val="start"/>
+      </w:pPr>
+      <w:r>
+        <w:rPr>
+          <w:rFonts w:ascii="Liberation Serif" w:hAnsi="Liberation Serif" w:eastAsia="Songti SC" w:cs="Arial Unicode MS"/>
+          <w:kern w:val="2"/>
+          <w:sz w:val="24"/>
+          <w:szCs w:val="24"/>
+        </w:rPr>
         <w:t>"I know the guest count and approximate dates. I should check availability before responding."</w:t>
       </w:r>
     </w:p>
     <w:p>
       <w:pPr>
         <w:pStyle w:val="BodyText"/>
-        <w:bidi w:val="0"/>
-        <w:jc w:val="start"/>
-        <w:rPr/>
-      </w:pPr>
-      <w:r>
-        <w:rPr/>
+        <w:jc w:val="start"/>
+      </w:pPr>
+      <w:r>
+        <w:rPr>
+          <w:rFonts w:ascii="Liberation Serif" w:hAnsi="Liberation Serif" w:eastAsia="Songti SC" w:cs="Arial Unicode MS"/>
+          <w:kern w:val="2"/>
+          <w:sz w:val="24"/>
+          <w:szCs w:val="24"/>
+        </w:rPr>
         <w:t>This is reasoning.</w:t>
       </w:r>
     </w:p>
     <w:p>
       <w:pPr>
         <w:pStyle w:val="Heading3"/>
-        <w:bidi w:val="0"/>
-        <w:jc w:val="start"/>
-        <w:rPr/>
-      </w:pPr>
-      <w:r>
-        <w:rPr/>
+        <w:jc w:val="start"/>
+      </w:pPr>
+      <w:r>
+        <w:rPr>
+          <w:rFonts w:ascii="Liberation Serif" w:hAnsi="Liberation Serif" w:eastAsia="Songti SC" w:cs="Arial Unicode MS"/>
+          <w:b/>
+          <w:bCs/>
+          <w:kern w:val="2"/>
+          <w:sz w:val="28"/>
+          <w:szCs w:val="28"/>
+        </w:rPr>
         <w:t>Superpower #3 — Use Tools</w:t>
       </w:r>
     </w:p>
     <w:p>
       <w:pPr>
         <w:pStyle w:val="BodyText"/>
-        <w:bidi w:val="0"/>
-        <w:jc w:val="start"/>
-        <w:rPr/>
-      </w:pPr>
-      <w:r>
-        <w:rPr/>
+        <w:jc w:val="start"/>
+      </w:pPr>
+      <w:r>
+        <w:rPr>
+          <w:rFonts w:ascii="Liberation Serif" w:hAnsi="Liberation Serif" w:eastAsia="Songti SC" w:cs="Arial Unicode MS"/>
+          <w:kern w:val="2"/>
+          <w:sz w:val="24"/>
+          <w:szCs w:val="24"/>
+        </w:rPr>
         <w:t>Humans use tools such as calculators, phones, and calendars.</w:t>
       </w:r>
     </w:p>
     <w:p>
       <w:pPr>
         <w:pStyle w:val="BodyText"/>
-        <w:bidi w:val="0"/>
-        <w:jc w:val="start"/>
-        <w:rPr/>
-      </w:pPr>
-      <w:r>
-        <w:rPr/>
+        <w:jc w:val="start"/>
+      </w:pPr>
+      <w:r>
+        <w:rPr>
+          <w:rFonts w:ascii="Liberation Serif" w:hAnsi="Liberation Serif" w:eastAsia="Songti SC" w:cs="Arial Unicode MS"/>
+          <w:kern w:val="2"/>
+          <w:sz w:val="24"/>
+          <w:szCs w:val="24"/>
+        </w:rPr>
         <w:t>AI agents use APIs and functions.</w:t>
       </w:r>
     </w:p>
     <w:p>
       <w:pPr>
         <w:pStyle w:val="BodyText"/>
-        <w:bidi w:val="0"/>
-        <w:jc w:val="start"/>
-        <w:rPr/>
-      </w:pPr>
-      <w:r>
-        <w:rPr/>
+        <w:jc w:val="start"/>
+      </w:pPr>
+      <w:r>
+        <w:rPr>
+          <w:rFonts w:ascii="Liberation Serif" w:hAnsi="Liberation Serif" w:eastAsia="Songti SC" w:cs="Arial Unicode MS"/>
+          <w:kern w:val="2"/>
+          <w:sz w:val="24"/>
+          <w:szCs w:val="24"/>
+        </w:rPr>
         <w:t>Example tool call:</w:t>
       </w:r>
     </w:p>
     <w:p>
       <w:pPr>
         <w:pStyle w:val="BodyText"/>
-        <w:bidi w:val="0"/>
-        <w:jc w:val="start"/>
-        <w:rPr/>
-      </w:pPr>
-      <w:r>
-        <w:rPr/>
+        <w:jc w:val="start"/>
+      </w:pPr>
+      <w:r>
+        <w:rPr>
+          <w:rFonts w:ascii="Liberation Serif" w:hAnsi="Liberation Serif" w:eastAsia="Songti SC" w:cs="Arial Unicode MS"/>
+          <w:kern w:val="2"/>
+          <w:sz w:val="24"/>
+          <w:szCs w:val="24"/>
+        </w:rPr>
         <w:t>Tool response:</w:t>
       </w:r>
     </w:p>
     <w:p>
       <w:pPr>
         <w:pStyle w:val="BodyText"/>
-        <w:bidi w:val="0"/>
-        <w:jc w:val="start"/>
-        <w:rPr/>
-      </w:pPr>
-      <w:r>
-        <w:rPr/>
+        <w:jc w:val="start"/>
+      </w:pPr>
+      <w:r>
+        <w:rPr>
+          <w:rFonts w:ascii="Liberation Serif" w:hAnsi="Liberation Serif" w:eastAsia="Songti SC" w:cs="Arial Unicode MS"/>
+          <w:kern w:val="2"/>
+          <w:sz w:val="24"/>
+          <w:szCs w:val="24"/>
+        </w:rPr>
         <w:t>The model itself did not know this information. The tool provided it.</w:t>
       </w:r>
     </w:p>
     <w:p>
       <w:pPr>
         <w:pStyle w:val="Heading3"/>
-        <w:bidi w:val="0"/>
-        <w:jc w:val="start"/>
-        <w:rPr/>
-      </w:pPr>
-      <w:r>
-        <w:rPr/>
+        <w:jc w:val="start"/>
+      </w:pPr>
+      <w:r>
+        <w:rPr>
+          <w:rFonts w:ascii="Liberation Serif" w:hAnsi="Liberation Serif" w:eastAsia="Songti SC" w:cs="Arial Unicode MS"/>
+          <w:b/>
+          <w:bCs/>
+          <w:kern w:val="2"/>
+          <w:sz w:val="28"/>
+          <w:szCs w:val="28"/>
+        </w:rPr>
         <w:t>Superpower #4 — Act</w:t>
       </w:r>
     </w:p>
     <w:p>
       <w:pPr>
         <w:pStyle w:val="BodyText"/>
-        <w:bidi w:val="0"/>
-        <w:jc w:val="start"/>
-        <w:rPr/>
-      </w:pPr>
-      <w:r>
-        <w:rPr/>
+        <w:jc w:val="start"/>
+      </w:pPr>
+      <w:r>
+        <w:rPr>
+          <w:rFonts w:ascii="Liberation Serif" w:hAnsi="Liberation Serif" w:eastAsia="Songti SC" w:cs="Arial Unicode MS"/>
+          <w:kern w:val="2"/>
+          <w:sz w:val="24"/>
+          <w:szCs w:val="24"/>
+        </w:rPr>
         <w:t>Now the agent performs work:</w:t>
       </w:r>
     </w:p>
     <w:p>
       <w:pPr>
         <w:pStyle w:val="BodyText"/>
-        <w:bidi w:val="0"/>
-        <w:jc w:val="start"/>
-        <w:rPr/>
-      </w:pPr>
-      <w:r>
-        <w:rPr/>
+        <w:jc w:val="start"/>
+      </w:pPr>
+      <w:r>
+        <w:rPr>
+          <w:rFonts w:ascii="Liberation Serif" w:hAnsi="Liberation Serif" w:eastAsia="Songti SC" w:cs="Arial Unicode MS"/>
+          <w:kern w:val="2"/>
+          <w:sz w:val="24"/>
+          <w:szCs w:val="24"/>
+        </w:rPr>
         <w:t>The customer receives a useful response, and your business moves forward automatically.</w:t>
       </w:r>
     </w:p>
     <w:p>
       <w:pPr>
         <w:pStyle w:val="Heading3"/>
-        <w:bidi w:val="0"/>
-        <w:jc w:val="start"/>
-        <w:rPr/>
-      </w:pPr>
-      <w:r>
-        <w:rPr/>
+        <w:jc w:val="start"/>
+      </w:pPr>
+      <w:r>
+        <w:rPr>
+          <w:rFonts w:ascii="Liberation Serif" w:hAnsi="Liberation Serif" w:eastAsia="Songti SC" w:cs="Arial Unicode MS"/>
+          <w:b/>
+          <w:bCs/>
+          <w:kern w:val="2"/>
+          <w:sz w:val="28"/>
+          <w:szCs w:val="28"/>
+        </w:rPr>
         <w:t>1.6 The Brain and the Hands</w:t>
       </w:r>
     </w:p>
     <w:p>
       <w:pPr>
         <w:pStyle w:val="BodyText"/>
-        <w:bidi w:val="0"/>
-        <w:jc w:val="start"/>
-        <w:rPr/>
-      </w:pPr>
-      <w:r>
-        <w:rPr/>
+        <w:jc w:val="start"/>
+      </w:pPr>
+      <w:r>
+        <w:rPr>
+          <w:rFonts w:ascii="Liberation Serif" w:hAnsi="Liberation Serif" w:eastAsia="Songti SC" w:cs="Arial Unicode MS"/>
+          <w:kern w:val="2"/>
+          <w:sz w:val="24"/>
+          <w:szCs w:val="24"/>
+        </w:rPr>
         <w:t>This is one of the most important mental models in the entire course.</w:t>
       </w:r>
     </w:p>
     <w:p>
       <w:pPr>
         <w:pStyle w:val="BodyText"/>
-        <w:bidi w:val="0"/>
-        <w:jc w:val="start"/>
-        <w:rPr/>
-      </w:pPr>
-      <w:r>
-        <w:rPr/>
+        <w:jc w:val="start"/>
+      </w:pPr>
+      <w:r>
         <w:drawing>
           <wp:inline distT="0" distB="0" distL="0" distR="0">
-            <wp:extent cx="4265930" cy="2844165"/>
+            <wp:extent cx="4267200" cy="2847975"/>
             <wp:effectExtent l="0" t="0" r="0" b="0"/>
-            <wp:docPr id="2" name="Image2" title="LangChain Tools: 5 Tools Every LLM Developer Should Know | by Vamshi Krishna Ginna | Medium"/>
+            <wp:docPr id="100001" name="LangChain Tools: 5 Tools Every LLM Developer Should Know | by Vamshi Krishna Ginna | Medium"/>
             <wp:cNvGraphicFramePr>
               <a:graphicFrameLocks xmlns:a="http://schemas.openxmlformats.org/drawingml/2006/main" noChangeAspect="1"/>
             </wp:cNvGraphicFramePr>
@@ -1480,26 +1785,23 @@
               <a:graphicData uri="http://schemas.openxmlformats.org/drawingml/2006/picture">
                 <pic:pic xmlns:pic="http://schemas.openxmlformats.org/drawingml/2006/picture">
                   <pic:nvPicPr>
-                    <pic:cNvPr id="2" name="Image2" title="LangChain Tools: 5 Tools Every LLM Developer Should Know | by Vamshi Krishna Ginna | Medium"/>
-                    <pic:cNvPicPr>
-                      <a:picLocks noChangeAspect="1" noChangeArrowheads="1"/>
-                    </pic:cNvPicPr>
+                    <pic:cNvPr id="100001" name="image100001"/>
+                    <pic:cNvPicPr/>
                   </pic:nvPicPr>
                   <pic:blipFill>
-                    <a:blip r:embed="rId3"/>
+                    <a:blip r:embed="rId9"/>
                     <a:stretch>
                       <a:fillRect/>
                     </a:stretch>
                   </pic:blipFill>
-                  <pic:spPr bwMode="auto">
+                  <pic:spPr>
                     <a:xfrm>
                       <a:off x="0" y="0"/>
-                      <a:ext cx="4265930" cy="2844165"/>
+                      <a:ext cx="4267200" cy="2847975"/>
                     </a:xfrm>
                     <a:prstGeom prst="rect">
                       <a:avLst/>
                     </a:prstGeom>
-                    <a:noFill/>
                   </pic:spPr>
                 </pic:pic>
               </a:graphicData>
@@ -1511,12 +1813,17 @@
     <w:p>
       <w:pPr>
         <w:pStyle w:val="Heading3"/>
-        <w:bidi w:val="0"/>
-        <w:jc w:val="start"/>
-        <w:rPr/>
-      </w:pPr>
-      <w:r>
-        <w:rPr/>
+        <w:jc w:val="start"/>
+      </w:pPr>
+      <w:r>
+        <w:rPr>
+          <w:rFonts w:ascii="Liberation Serif" w:hAnsi="Liberation Serif" w:eastAsia="Songti SC" w:cs="Arial Unicode MS"/>
+          <w:b/>
+          <w:bCs/>
+          <w:kern w:val="2"/>
+          <w:sz w:val="28"/>
+          <w:szCs w:val="28"/>
+        </w:rPr>
         <w:t>Brain (LLM)</w:t>
       </w:r>
     </w:p>
@@ -1529,15 +1836,18 @@
         </w:numPr>
         <w:tabs>
           <w:tab w:val="clear" w:pos="709"/>
-          <w:tab w:val="left" w:pos="709" w:leader="none"/>
-        </w:tabs>
-        <w:bidi w:val="0"/>
-        <w:ind w:hanging="283" w:start="709"/>
-        <w:jc w:val="start"/>
-        <w:rPr/>
-      </w:pPr>
-      <w:r>
-        <w:rPr/>
+          <w:tab w:val="left" w:pos="709"/>
+        </w:tabs>
+        <w:ind w:left="709" w:hanging="283"/>
+        <w:jc w:val="start"/>
+      </w:pPr>
+      <w:r>
+        <w:rPr>
+          <w:rFonts w:ascii="Liberation Serif" w:hAnsi="Liberation Serif" w:eastAsia="Songti SC" w:cs="Arial Unicode MS"/>
+          <w:kern w:val="2"/>
+          <w:sz w:val="24"/>
+          <w:szCs w:val="24"/>
+        </w:rPr>
         <w:t>Understands language</w:t>
       </w:r>
     </w:p>
@@ -1550,15 +1860,18 @@
         </w:numPr>
         <w:tabs>
           <w:tab w:val="clear" w:pos="709"/>
-          <w:tab w:val="left" w:pos="709" w:leader="none"/>
-        </w:tabs>
-        <w:bidi w:val="0"/>
-        <w:ind w:hanging="283" w:start="709"/>
-        <w:jc w:val="start"/>
-        <w:rPr/>
-      </w:pPr>
-      <w:r>
-        <w:rPr/>
+          <w:tab w:val="left" w:pos="709"/>
+        </w:tabs>
+        <w:ind w:left="709" w:hanging="283"/>
+        <w:jc w:val="start"/>
+      </w:pPr>
+      <w:r>
+        <w:rPr>
+          <w:rFonts w:ascii="Liberation Serif" w:hAnsi="Liberation Serif" w:eastAsia="Songti SC" w:cs="Arial Unicode MS"/>
+          <w:kern w:val="2"/>
+          <w:sz w:val="24"/>
+          <w:szCs w:val="24"/>
+        </w:rPr>
         <w:t>Reasons about problems</w:t>
       </w:r>
     </w:p>
@@ -1571,15 +1884,18 @@
         </w:numPr>
         <w:tabs>
           <w:tab w:val="clear" w:pos="709"/>
-          <w:tab w:val="left" w:pos="709" w:leader="none"/>
-        </w:tabs>
-        <w:bidi w:val="0"/>
-        <w:ind w:hanging="283" w:start="709"/>
-        <w:jc w:val="start"/>
-        <w:rPr/>
-      </w:pPr>
-      <w:r>
-        <w:rPr/>
+          <w:tab w:val="left" w:pos="709"/>
+        </w:tabs>
+        <w:ind w:left="709" w:hanging="283"/>
+        <w:jc w:val="start"/>
+      </w:pPr>
+      <w:r>
+        <w:rPr>
+          <w:rFonts w:ascii="Liberation Serif" w:hAnsi="Liberation Serif" w:eastAsia="Songti SC" w:cs="Arial Unicode MS"/>
+          <w:kern w:val="2"/>
+          <w:sz w:val="24"/>
+          <w:szCs w:val="24"/>
+        </w:rPr>
         <w:t>Plans next steps</w:t>
       </w:r>
     </w:p>
@@ -1592,27 +1908,35 @@
         </w:numPr>
         <w:tabs>
           <w:tab w:val="clear" w:pos="709"/>
-          <w:tab w:val="left" w:pos="709" w:leader="none"/>
-        </w:tabs>
-        <w:bidi w:val="0"/>
-        <w:ind w:hanging="283" w:start="709"/>
-        <w:jc w:val="start"/>
-        <w:rPr/>
-      </w:pPr>
-      <w:r>
-        <w:rPr/>
+          <w:tab w:val="left" w:pos="709"/>
+        </w:tabs>
+        <w:ind w:left="709" w:hanging="283"/>
+        <w:jc w:val="start"/>
+      </w:pPr>
+      <w:r>
+        <w:rPr>
+          <w:rFonts w:ascii="Liberation Serif" w:hAnsi="Liberation Serif" w:eastAsia="Songti SC" w:cs="Arial Unicode MS"/>
+          <w:kern w:val="2"/>
+          <w:sz w:val="24"/>
+          <w:szCs w:val="24"/>
+        </w:rPr>
         <w:t>Generates responses</w:t>
       </w:r>
     </w:p>
     <w:p>
       <w:pPr>
         <w:pStyle w:val="Heading3"/>
-        <w:bidi w:val="0"/>
-        <w:jc w:val="start"/>
-        <w:rPr/>
-      </w:pPr>
-      <w:r>
-        <w:rPr/>
+        <w:jc w:val="start"/>
+      </w:pPr>
+      <w:r>
+        <w:rPr>
+          <w:rFonts w:ascii="Liberation Serif" w:hAnsi="Liberation Serif" w:eastAsia="Songti SC" w:cs="Arial Unicode MS"/>
+          <w:b/>
+          <w:bCs/>
+          <w:kern w:val="2"/>
+          <w:sz w:val="28"/>
+          <w:szCs w:val="28"/>
+        </w:rPr>
         <w:t>Hands (Tools)</w:t>
       </w:r>
     </w:p>
@@ -1625,15 +1949,18 @@
         </w:numPr>
         <w:tabs>
           <w:tab w:val="clear" w:pos="709"/>
-          <w:tab w:val="left" w:pos="709" w:leader="none"/>
-        </w:tabs>
-        <w:bidi w:val="0"/>
-        <w:ind w:hanging="283" w:start="709"/>
-        <w:jc w:val="start"/>
-        <w:rPr/>
-      </w:pPr>
-      <w:r>
-        <w:rPr/>
+          <w:tab w:val="left" w:pos="709"/>
+        </w:tabs>
+        <w:ind w:left="709" w:hanging="283"/>
+        <w:jc w:val="start"/>
+      </w:pPr>
+      <w:r>
+        <w:rPr>
+          <w:rFonts w:ascii="Liberation Serif" w:hAnsi="Liberation Serif" w:eastAsia="Songti SC" w:cs="Arial Unicode MS"/>
+          <w:kern w:val="2"/>
+          <w:sz w:val="24"/>
+          <w:szCs w:val="24"/>
+        </w:rPr>
         <w:t>Check calendars</w:t>
       </w:r>
     </w:p>
@@ -1646,15 +1973,18 @@
         </w:numPr>
         <w:tabs>
           <w:tab w:val="clear" w:pos="709"/>
-          <w:tab w:val="left" w:pos="709" w:leader="none"/>
-        </w:tabs>
-        <w:bidi w:val="0"/>
-        <w:ind w:hanging="283" w:start="709"/>
-        <w:jc w:val="start"/>
-        <w:rPr/>
-      </w:pPr>
-      <w:r>
-        <w:rPr/>
+          <w:tab w:val="left" w:pos="709"/>
+        </w:tabs>
+        <w:ind w:left="709" w:hanging="283"/>
+        <w:jc w:val="start"/>
+      </w:pPr>
+      <w:r>
+        <w:rPr>
+          <w:rFonts w:ascii="Liberation Serif" w:hAnsi="Liberation Serif" w:eastAsia="Songti SC" w:cs="Arial Unicode MS"/>
+          <w:kern w:val="2"/>
+          <w:sz w:val="24"/>
+          <w:szCs w:val="24"/>
+        </w:rPr>
         <w:t>Read databases</w:t>
       </w:r>
     </w:p>
@@ -1667,15 +1997,18 @@
         </w:numPr>
         <w:tabs>
           <w:tab w:val="clear" w:pos="709"/>
-          <w:tab w:val="left" w:pos="709" w:leader="none"/>
-        </w:tabs>
-        <w:bidi w:val="0"/>
-        <w:ind w:hanging="283" w:start="709"/>
-        <w:jc w:val="start"/>
-        <w:rPr/>
-      </w:pPr>
-      <w:r>
-        <w:rPr/>
+          <w:tab w:val="left" w:pos="709"/>
+        </w:tabs>
+        <w:ind w:left="709" w:hanging="283"/>
+        <w:jc w:val="start"/>
+      </w:pPr>
+      <w:r>
+        <w:rPr>
+          <w:rFonts w:ascii="Liberation Serif" w:hAnsi="Liberation Serif" w:eastAsia="Songti SC" w:cs="Arial Unicode MS"/>
+          <w:kern w:val="2"/>
+          <w:sz w:val="24"/>
+          <w:szCs w:val="24"/>
+        </w:rPr>
         <w:t>Call APIs</w:t>
       </w:r>
     </w:p>
@@ -1688,15 +2021,18 @@
         </w:numPr>
         <w:tabs>
           <w:tab w:val="clear" w:pos="709"/>
-          <w:tab w:val="left" w:pos="709" w:leader="none"/>
-        </w:tabs>
-        <w:bidi w:val="0"/>
-        <w:ind w:hanging="283" w:start="709"/>
-        <w:jc w:val="start"/>
-        <w:rPr/>
-      </w:pPr>
-      <w:r>
-        <w:rPr/>
+          <w:tab w:val="left" w:pos="709"/>
+        </w:tabs>
+        <w:ind w:left="709" w:hanging="283"/>
+        <w:jc w:val="start"/>
+      </w:pPr>
+      <w:r>
+        <w:rPr>
+          <w:rFonts w:ascii="Liberation Serif" w:hAnsi="Liberation Serif" w:eastAsia="Songti SC" w:cs="Arial Unicode MS"/>
+          <w:kern w:val="2"/>
+          <w:sz w:val="24"/>
+          <w:szCs w:val="24"/>
+        </w:rPr>
         <w:t>Post comments</w:t>
       </w:r>
     </w:p>
@@ -1709,327 +2045,412 @@
         </w:numPr>
         <w:tabs>
           <w:tab w:val="clear" w:pos="709"/>
-          <w:tab w:val="left" w:pos="709" w:leader="none"/>
-        </w:tabs>
-        <w:bidi w:val="0"/>
-        <w:ind w:hanging="283" w:start="709"/>
-        <w:jc w:val="start"/>
-        <w:rPr/>
-      </w:pPr>
-      <w:r>
-        <w:rPr/>
+          <w:tab w:val="left" w:pos="709"/>
+        </w:tabs>
+        <w:ind w:left="709" w:hanging="283"/>
+        <w:jc w:val="start"/>
+      </w:pPr>
+      <w:r>
+        <w:rPr>
+          <w:rFonts w:ascii="Liberation Serif" w:hAnsi="Liberation Serif" w:eastAsia="Songti SC" w:cs="Arial Unicode MS"/>
+          <w:kern w:val="2"/>
+          <w:sz w:val="24"/>
+          <w:szCs w:val="24"/>
+        </w:rPr>
         <w:t>Save records</w:t>
       </w:r>
     </w:p>
     <w:p>
       <w:pPr>
         <w:pStyle w:val="BodyText"/>
-        <w:bidi w:val="0"/>
-        <w:jc w:val="start"/>
-        <w:rPr/>
-      </w:pPr>
-      <w:r>
-        <w:rPr/>
+        <w:jc w:val="start"/>
+      </w:pPr>
+      <w:r>
+        <w:rPr>
+          <w:rFonts w:ascii="Liberation Serif" w:hAnsi="Liberation Serif" w:eastAsia="Songti SC" w:cs="Arial Unicode MS"/>
+          <w:kern w:val="2"/>
+          <w:sz w:val="24"/>
+          <w:szCs w:val="24"/>
+        </w:rPr>
         <w:t>Rule to remember:</w:t>
       </w:r>
     </w:p>
     <w:p>
       <w:pPr>
         <w:pStyle w:val="BodyText"/>
-        <w:bidi w:val="0"/>
-        <w:jc w:val="start"/>
-        <w:rPr/>
-      </w:pPr>
-      <w:r>
-        <w:rPr/>
+        <w:jc w:val="start"/>
+      </w:pPr>
+      <w:r>
+        <w:rPr>
+          <w:rFonts w:ascii="Liberation Serif" w:hAnsi="Liberation Serif" w:eastAsia="Songti SC" w:cs="Arial Unicode MS"/>
+          <w:kern w:val="2"/>
+          <w:sz w:val="24"/>
+          <w:szCs w:val="24"/>
+        </w:rPr>
         <w:t>The model thinks. The tools do.</w:t>
       </w:r>
     </w:p>
     <w:p>
       <w:pPr>
         <w:pStyle w:val="BodyText"/>
-        <w:bidi w:val="0"/>
-        <w:jc w:val="start"/>
-        <w:rPr/>
-      </w:pPr>
-      <w:r>
-        <w:rPr/>
+        <w:jc w:val="start"/>
+      </w:pPr>
+      <w:r>
+        <w:rPr>
+          <w:rFonts w:ascii="Liberation Serif" w:hAnsi="Liberation Serif" w:eastAsia="Songti SC" w:cs="Arial Unicode MS"/>
+          <w:kern w:val="2"/>
+          <w:sz w:val="24"/>
+          <w:szCs w:val="24"/>
+        </w:rPr>
         <w:t>Whenever you are confused about an AI architecture, ask:</w:t>
       </w:r>
     </w:p>
     <w:p>
       <w:pPr>
         <w:pStyle w:val="BodyText"/>
-        <w:bidi w:val="0"/>
-        <w:jc w:val="start"/>
-        <w:rPr/>
-      </w:pPr>
-      <w:r>
-        <w:rPr/>
+        <w:jc w:val="start"/>
+      </w:pPr>
+      <w:r>
+        <w:rPr>
+          <w:rFonts w:ascii="Liberation Serif" w:hAnsi="Liberation Serif" w:eastAsia="Songti SC" w:cs="Arial Unicode MS"/>
+          <w:kern w:val="2"/>
+          <w:sz w:val="24"/>
+          <w:szCs w:val="24"/>
+        </w:rPr>
         <w:t>"Is this something the model can infer, or something a tool must fetch?"</w:t>
       </w:r>
     </w:p>
     <w:p>
       <w:pPr>
         <w:pStyle w:val="BodyText"/>
-        <w:bidi w:val="0"/>
-        <w:jc w:val="start"/>
-        <w:rPr/>
-      </w:pPr>
-      <w:r>
-        <w:rPr/>
+        <w:jc w:val="start"/>
+      </w:pPr>
+      <w:r>
+        <w:rPr>
+          <w:rFonts w:ascii="Liberation Serif" w:hAnsi="Liberation Serif" w:eastAsia="Songti SC" w:cs="Arial Unicode MS"/>
+          <w:kern w:val="2"/>
+          <w:sz w:val="24"/>
+          <w:szCs w:val="24"/>
+        </w:rPr>
         <w:t>Availability, prices, bookings, and Facebook posts are tool data, not model knowledge.</w:t>
       </w:r>
     </w:p>
     <w:p>
       <w:pPr>
         <w:pStyle w:val="Heading3"/>
-        <w:bidi w:val="0"/>
-        <w:jc w:val="start"/>
-        <w:rPr/>
-      </w:pPr>
-      <w:r>
-        <w:rPr/>
+        <w:jc w:val="start"/>
+      </w:pPr>
+      <w:r>
+        <w:rPr>
+          <w:rFonts w:ascii="Liberation Serif" w:hAnsi="Liberation Serif" w:eastAsia="Songti SC" w:cs="Arial Unicode MS"/>
+          <w:b/>
+          <w:bCs/>
+          <w:kern w:val="2"/>
+          <w:sz w:val="28"/>
+          <w:szCs w:val="28"/>
+        </w:rPr>
         <w:t>1.7 Applying This to Your Project</w:t>
       </w:r>
     </w:p>
     <w:p>
       <w:pPr>
         <w:pStyle w:val="BodyText"/>
-        <w:bidi w:val="0"/>
-        <w:jc w:val="start"/>
-        <w:rPr/>
-      </w:pPr>
-      <w:r>
-        <w:rPr/>
+        <w:jc w:val="start"/>
+      </w:pPr>
+      <w:r>
+        <w:rPr>
+          <w:rFonts w:ascii="Liberation Serif" w:hAnsi="Liberation Serif" w:eastAsia="Songti SC" w:cs="Arial Unicode MS"/>
+          <w:kern w:val="2"/>
+          <w:sz w:val="24"/>
+          <w:szCs w:val="24"/>
+        </w:rPr>
         <w:t>Let's walk through a real example.</w:t>
       </w:r>
     </w:p>
     <w:p>
       <w:pPr>
         <w:pStyle w:val="BodyText"/>
-        <w:bidi w:val="0"/>
-        <w:jc w:val="start"/>
-        <w:rPr/>
-      </w:pPr>
-      <w:r>
-        <w:rPr/>
+        <w:jc w:val="start"/>
+      </w:pPr>
+      <w:r>
+        <w:rPr>
+          <w:rFonts w:ascii="Liberation Serif" w:hAnsi="Liberation Serif" w:eastAsia="Songti SC" w:cs="Arial Unicode MS"/>
+          <w:kern w:val="2"/>
+          <w:sz w:val="24"/>
+          <w:szCs w:val="24"/>
+        </w:rPr>
         <w:t>Facebook Post</w:t>
       </w:r>
     </w:p>
     <w:p>
       <w:pPr>
         <w:pStyle w:val="BodyText"/>
-        <w:bidi w:val="0"/>
-        <w:jc w:val="start"/>
-        <w:rPr/>
-      </w:pPr>
-      <w:r>
-        <w:rPr/>
+        <w:jc w:val="start"/>
+      </w:pPr>
+      <w:r>
+        <w:rPr>
+          <w:rFonts w:ascii="Liberation Serif" w:hAnsi="Liberation Serif" w:eastAsia="Songti SC" w:cs="Arial Unicode MS"/>
+          <w:kern w:val="2"/>
+          <w:sz w:val="24"/>
+          <w:szCs w:val="24"/>
+        </w:rPr>
         <w:t>"Looking for accommodation for 8 people on August 12–14."</w:t>
       </w:r>
     </w:p>
     <w:p>
       <w:pPr>
         <w:pStyle w:val="BodyText"/>
-        <w:bidi w:val="0"/>
-        <w:jc w:val="start"/>
-        <w:rPr/>
-      </w:pPr>
-      <w:r>
-        <w:rPr/>
+        <w:jc w:val="start"/>
+      </w:pPr>
+      <w:r>
+        <w:rPr>
+          <w:rFonts w:ascii="Liberation Serif" w:hAnsi="Liberation Serif" w:eastAsia="Songti SC" w:cs="Arial Unicode MS"/>
+          <w:kern w:val="2"/>
+          <w:sz w:val="24"/>
+          <w:szCs w:val="24"/>
+        </w:rPr>
         <w:t>The agent's internal workflow:</w:t>
       </w:r>
     </w:p>
     <w:p>
       <w:pPr>
         <w:pStyle w:val="BodyText"/>
-        <w:bidi w:val="0"/>
-        <w:jc w:val="start"/>
-        <w:rPr/>
-      </w:pPr>
-      <w:r>
-        <w:rPr/>
+        <w:jc w:val="start"/>
+      </w:pPr>
+      <w:r>
+        <w:rPr>
+          <w:rFonts w:ascii="Liberation Serif" w:hAnsi="Liberation Serif" w:eastAsia="Songti SC" w:cs="Arial Unicode MS"/>
+          <w:kern w:val="2"/>
+          <w:sz w:val="24"/>
+          <w:szCs w:val="24"/>
+        </w:rPr>
         <w:t>1</w:t>
       </w:r>
     </w:p>
     <w:p>
       <w:pPr>
         <w:pStyle w:val="BodyText"/>
-        <w:bidi w:val="0"/>
-        <w:jc w:val="start"/>
-        <w:rPr/>
-      </w:pPr>
-      <w:r>
-        <w:rPr/>
+        <w:jc w:val="start"/>
+      </w:pPr>
+      <w:r>
+        <w:rPr>
+          <w:rFonts w:ascii="Liberation Serif" w:hAnsi="Liberation Serif" w:eastAsia="Songti SC" w:cs="Arial Unicode MS"/>
+          <w:kern w:val="2"/>
+          <w:sz w:val="24"/>
+          <w:szCs w:val="24"/>
+        </w:rPr>
         <w:t>Understand → guests = 8, dates = Aug 12–14</w:t>
       </w:r>
     </w:p>
     <w:p>
       <w:pPr>
         <w:pStyle w:val="BodyText"/>
-        <w:bidi w:val="0"/>
-        <w:jc w:val="start"/>
-        <w:rPr/>
-      </w:pPr>
-      <w:r>
-        <w:rPr/>
+        <w:jc w:val="start"/>
+      </w:pPr>
+      <w:r>
+        <w:rPr>
+          <w:rFonts w:ascii="Liberation Serif" w:hAnsi="Liberation Serif" w:eastAsia="Songti SC" w:cs="Arial Unicode MS"/>
+          <w:kern w:val="2"/>
+          <w:sz w:val="24"/>
+          <w:szCs w:val="24"/>
+        </w:rPr>
         <w:t>2</w:t>
       </w:r>
     </w:p>
     <w:p>
       <w:pPr>
         <w:pStyle w:val="BodyText"/>
-        <w:bidi w:val="0"/>
-        <w:jc w:val="start"/>
-        <w:rPr/>
-      </w:pPr>
-      <w:r>
-        <w:rPr/>
+        <w:jc w:val="start"/>
+      </w:pPr>
+      <w:r>
+        <w:rPr>
+          <w:rFonts w:ascii="Liberation Serif" w:hAnsi="Liberation Serif" w:eastAsia="Songti SC" w:cs="Arial Unicode MS"/>
+          <w:kern w:val="2"/>
+          <w:sz w:val="24"/>
+          <w:szCs w:val="24"/>
+        </w:rPr>
         <w:t>Think → "I need availability before answering."</w:t>
       </w:r>
     </w:p>
     <w:p>
       <w:pPr>
         <w:pStyle w:val="BodyText"/>
-        <w:bidi w:val="0"/>
-        <w:jc w:val="start"/>
-        <w:rPr/>
-      </w:pPr>
-      <w:r>
-        <w:rPr/>
+        <w:jc w:val="start"/>
+      </w:pPr>
+      <w:r>
+        <w:rPr>
+          <w:rFonts w:ascii="Liberation Serif" w:hAnsi="Liberation Serif" w:eastAsia="Songti SC" w:cs="Arial Unicode MS"/>
+          <w:kern w:val="2"/>
+          <w:sz w:val="24"/>
+          <w:szCs w:val="24"/>
+        </w:rPr>
         <w:t>3</w:t>
       </w:r>
     </w:p>
     <w:p>
       <w:pPr>
         <w:pStyle w:val="BodyText"/>
-        <w:bidi w:val="0"/>
-        <w:jc w:val="start"/>
-        <w:rPr/>
-      </w:pPr>
-      <w:r>
-        <w:rPr/>
+        <w:jc w:val="start"/>
+      </w:pPr>
+      <w:r>
+        <w:rPr>
+          <w:rFonts w:ascii="Liberation Serif" w:hAnsi="Liberation Serif" w:eastAsia="Songti SC" w:cs="Arial Unicode MS"/>
+          <w:kern w:val="2"/>
+          <w:sz w:val="24"/>
+          <w:szCs w:val="24"/>
+        </w:rPr>
         <w:t>Use Tool → check_calendar(Aug 12–14)</w:t>
       </w:r>
     </w:p>
     <w:p>
       <w:pPr>
         <w:pStyle w:val="BodyText"/>
-        <w:bidi w:val="0"/>
-        <w:jc w:val="start"/>
-        <w:rPr/>
-      </w:pPr>
-      <w:r>
-        <w:rPr/>
+        <w:jc w:val="start"/>
+      </w:pPr>
+      <w:r>
+        <w:rPr>
+          <w:rFonts w:ascii="Liberation Serif" w:hAnsi="Liberation Serif" w:eastAsia="Songti SC" w:cs="Arial Unicode MS"/>
+          <w:kern w:val="2"/>
+          <w:sz w:val="24"/>
+          <w:szCs w:val="24"/>
+        </w:rPr>
         <w:t>4</w:t>
       </w:r>
     </w:p>
     <w:p>
       <w:pPr>
         <w:pStyle w:val="BodyText"/>
-        <w:bidi w:val="0"/>
-        <w:jc w:val="start"/>
-        <w:rPr/>
-      </w:pPr>
-      <w:r>
-        <w:rPr/>
+        <w:jc w:val="start"/>
+      </w:pPr>
+      <w:r>
+        <w:rPr>
+          <w:rFonts w:ascii="Liberation Serif" w:hAnsi="Liberation Serif" w:eastAsia="Songti SC" w:cs="Arial Unicode MS"/>
+          <w:kern w:val="2"/>
+          <w:sz w:val="24"/>
+          <w:szCs w:val="24"/>
+        </w:rPr>
         <w:t>Observe Result → available = true</w:t>
       </w:r>
     </w:p>
     <w:p>
       <w:pPr>
         <w:pStyle w:val="BodyText"/>
-        <w:bidi w:val="0"/>
-        <w:jc w:val="start"/>
-        <w:rPr/>
-      </w:pPr>
-      <w:r>
-        <w:rPr/>
+        <w:jc w:val="start"/>
+      </w:pPr>
+      <w:r>
+        <w:rPr>
+          <w:rFonts w:ascii="Liberation Serif" w:hAnsi="Liberation Serif" w:eastAsia="Songti SC" w:cs="Arial Unicode MS"/>
+          <w:kern w:val="2"/>
+          <w:sz w:val="24"/>
+          <w:szCs w:val="24"/>
+        </w:rPr>
         <w:t>5</w:t>
       </w:r>
     </w:p>
     <w:p>
       <w:pPr>
         <w:pStyle w:val="BodyText"/>
-        <w:bidi w:val="0"/>
-        <w:jc w:val="start"/>
-        <w:rPr/>
-      </w:pPr>
-      <w:r>
-        <w:rPr/>
+        <w:jc w:val="start"/>
+      </w:pPr>
+      <w:r>
+        <w:rPr>
+          <w:rFonts w:ascii="Liberation Serif" w:hAnsi="Liberation Serif" w:eastAsia="Songti SC" w:cs="Arial Unicode MS"/>
+          <w:kern w:val="2"/>
+          <w:sz w:val="24"/>
+          <w:szCs w:val="24"/>
+        </w:rPr>
         <w:t>Act → generate and post a marketing reply</w:t>
       </w:r>
     </w:p>
     <w:p>
       <w:pPr>
         <w:pStyle w:val="BodyText"/>
-        <w:bidi w:val="0"/>
-        <w:jc w:val="start"/>
-        <w:rPr/>
-      </w:pPr>
-      <w:r>
-        <w:rPr/>
+        <w:jc w:val="start"/>
+      </w:pPr>
+      <w:r>
+        <w:rPr>
+          <w:rFonts w:ascii="Liberation Serif" w:hAnsi="Liberation Serif" w:eastAsia="Songti SC" w:cs="Arial Unicode MS"/>
+          <w:kern w:val="2"/>
+          <w:sz w:val="24"/>
+          <w:szCs w:val="24"/>
+        </w:rPr>
         <w:t>Final reply:</w:t>
       </w:r>
     </w:p>
     <w:p>
       <w:pPr>
         <w:pStyle w:val="BodyText"/>
-        <w:bidi w:val="0"/>
-        <w:jc w:val="start"/>
-        <w:rPr/>
-      </w:pPr>
-      <w:r>
-        <w:rPr/>
+        <w:jc w:val="start"/>
+      </w:pPr>
+      <w:r>
+        <w:rPr>
+          <w:rFonts w:ascii="Liberation Serif" w:hAnsi="Liberation Serif" w:eastAsia="Songti SC" w:cs="Arial Unicode MS"/>
+          <w:kern w:val="2"/>
+          <w:sz w:val="24"/>
+          <w:szCs w:val="24"/>
+        </w:rPr>
         <w:t>Hi! 😊 Great news—our Airbnb can comfortably accommodate 8 guests, and the dates Aug 12–14 are currently available. The property includes a private pool, fast WiFi, a fully equipped kitchen, and free parking. Here's the listing link: …</w:t>
       </w:r>
     </w:p>
     <w:p>
       <w:pPr>
         <w:pStyle w:val="BodyText"/>
-        <w:bidi w:val="0"/>
-        <w:jc w:val="start"/>
-        <w:rPr/>
-      </w:pPr>
-      <w:r>
-        <w:rPr/>
+        <w:jc w:val="start"/>
+      </w:pPr>
+      <w:r>
+        <w:rPr>
+          <w:rFonts w:ascii="Liberation Serif" w:hAnsi="Liberation Serif" w:eastAsia="Songti SC" w:cs="Arial Unicode MS"/>
+          <w:kern w:val="2"/>
+          <w:sz w:val="24"/>
+          <w:szCs w:val="24"/>
+        </w:rPr>
         <w:t>That is an end-to-end agentic workflow.</w:t>
       </w:r>
     </w:p>
     <w:p>
       <w:pPr>
         <w:pStyle w:val="Heading3"/>
-        <w:bidi w:val="0"/>
-        <w:jc w:val="start"/>
-        <w:rPr/>
-      </w:pPr>
-      <w:r>
-        <w:rPr/>
+        <w:jc w:val="start"/>
+      </w:pPr>
+      <w:r>
+        <w:rPr>
+          <w:rFonts w:ascii="Liberation Serif" w:hAnsi="Liberation Serif" w:eastAsia="Songti SC" w:cs="Arial Unicode MS"/>
+          <w:b/>
+          <w:bCs/>
+          <w:kern w:val="2"/>
+          <w:sz w:val="28"/>
+          <w:szCs w:val="28"/>
+        </w:rPr>
         <w:t>1.8 Why This Matters</w:t>
       </w:r>
     </w:p>
     <w:p>
       <w:pPr>
         <w:pStyle w:val="BodyText"/>
-        <w:bidi w:val="0"/>
-        <w:jc w:val="start"/>
-        <w:rPr/>
-      </w:pPr>
-      <w:r>
-        <w:rPr/>
+        <w:jc w:val="start"/>
+      </w:pPr>
+      <w:r>
+        <w:rPr>
+          <w:rFonts w:ascii="Liberation Serif" w:hAnsi="Liberation Serif" w:eastAsia="Songti SC" w:cs="Arial Unicode MS"/>
+          <w:kern w:val="2"/>
+          <w:sz w:val="24"/>
+          <w:szCs w:val="24"/>
+        </w:rPr>
         <w:t>Many beginners believe AI projects are mostly about prompts.</w:t>
       </w:r>
     </w:p>
     <w:p>
       <w:pPr>
         <w:pStyle w:val="BodyText"/>
-        <w:bidi w:val="0"/>
-        <w:jc w:val="start"/>
-        <w:rPr/>
-      </w:pPr>
-      <w:r>
-        <w:rPr/>
+        <w:jc w:val="start"/>
+      </w:pPr>
+      <w:r>
+        <w:rPr>
+          <w:rFonts w:ascii="Liberation Serif" w:hAnsi="Liberation Serif" w:eastAsia="Songti SC" w:cs="Arial Unicode MS"/>
+          <w:kern w:val="2"/>
+          <w:sz w:val="24"/>
+          <w:szCs w:val="24"/>
+        </w:rPr>
         <w:t>In reality, production AI systems are mostly about orchestration:</w:t>
       </w:r>
     </w:p>
@@ -2042,15 +2463,18 @@
         </w:numPr>
         <w:tabs>
           <w:tab w:val="clear" w:pos="709"/>
-          <w:tab w:val="left" w:pos="709" w:leader="none"/>
-        </w:tabs>
-        <w:bidi w:val="0"/>
-        <w:ind w:hanging="283" w:start="709"/>
-        <w:jc w:val="start"/>
-        <w:rPr/>
-      </w:pPr>
-      <w:r>
-        <w:rPr/>
+          <w:tab w:val="left" w:pos="709"/>
+        </w:tabs>
+        <w:ind w:left="709" w:hanging="283"/>
+        <w:jc w:val="start"/>
+      </w:pPr>
+      <w:r>
+        <w:rPr>
+          <w:rFonts w:ascii="Liberation Serif" w:hAnsi="Liberation Serif" w:eastAsia="Songti SC" w:cs="Arial Unicode MS"/>
+          <w:kern w:val="2"/>
+          <w:sz w:val="24"/>
+          <w:szCs w:val="24"/>
+        </w:rPr>
         <w:t>When should the model run?</w:t>
       </w:r>
     </w:p>
@@ -2063,15 +2487,18 @@
         </w:numPr>
         <w:tabs>
           <w:tab w:val="clear" w:pos="709"/>
-          <w:tab w:val="left" w:pos="709" w:leader="none"/>
-        </w:tabs>
-        <w:bidi w:val="0"/>
-        <w:ind w:hanging="283" w:start="709"/>
-        <w:jc w:val="start"/>
-        <w:rPr/>
-      </w:pPr>
-      <w:r>
-        <w:rPr/>
+          <w:tab w:val="left" w:pos="709"/>
+        </w:tabs>
+        <w:ind w:left="709" w:hanging="283"/>
+        <w:jc w:val="start"/>
+      </w:pPr>
+      <w:r>
+        <w:rPr>
+          <w:rFonts w:ascii="Liberation Serif" w:hAnsi="Liberation Serif" w:eastAsia="Songti SC" w:cs="Arial Unicode MS"/>
+          <w:kern w:val="2"/>
+          <w:sz w:val="24"/>
+          <w:szCs w:val="24"/>
+        </w:rPr>
         <w:t>What tools can it use?</w:t>
       </w:r>
     </w:p>
@@ -2084,15 +2511,18 @@
         </w:numPr>
         <w:tabs>
           <w:tab w:val="clear" w:pos="709"/>
-          <w:tab w:val="left" w:pos="709" w:leader="none"/>
-        </w:tabs>
-        <w:bidi w:val="0"/>
-        <w:ind w:hanging="283" w:start="709"/>
-        <w:jc w:val="start"/>
-        <w:rPr/>
-      </w:pPr>
-      <w:r>
-        <w:rPr/>
+          <w:tab w:val="left" w:pos="709"/>
+        </w:tabs>
+        <w:ind w:left="709" w:hanging="283"/>
+        <w:jc w:val="start"/>
+      </w:pPr>
+      <w:r>
+        <w:rPr>
+          <w:rFonts w:ascii="Liberation Serif" w:hAnsi="Liberation Serif" w:eastAsia="Songti SC" w:cs="Arial Unicode MS"/>
+          <w:kern w:val="2"/>
+          <w:sz w:val="24"/>
+          <w:szCs w:val="24"/>
+        </w:rPr>
         <w:t>What permissions does it have?</w:t>
       </w:r>
     </w:p>
@@ -2105,15 +2535,18 @@
         </w:numPr>
         <w:tabs>
           <w:tab w:val="clear" w:pos="709"/>
-          <w:tab w:val="left" w:pos="709" w:leader="none"/>
-        </w:tabs>
-        <w:bidi w:val="0"/>
-        <w:ind w:hanging="283" w:start="709"/>
-        <w:jc w:val="start"/>
-        <w:rPr/>
-      </w:pPr>
-      <w:r>
-        <w:rPr/>
+          <w:tab w:val="left" w:pos="709"/>
+        </w:tabs>
+        <w:ind w:left="709" w:hanging="283"/>
+        <w:jc w:val="start"/>
+      </w:pPr>
+      <w:r>
+        <w:rPr>
+          <w:rFonts w:ascii="Liberation Serif" w:hAnsi="Liberation Serif" w:eastAsia="Songti SC" w:cs="Arial Unicode MS"/>
+          <w:kern w:val="2"/>
+          <w:sz w:val="24"/>
+          <w:szCs w:val="24"/>
+        </w:rPr>
         <w:t>What happens if a tool fails?</w:t>
       </w:r>
     </w:p>
@@ -2126,15 +2559,18 @@
         </w:numPr>
         <w:tabs>
           <w:tab w:val="clear" w:pos="709"/>
-          <w:tab w:val="left" w:pos="709" w:leader="none"/>
-        </w:tabs>
-        <w:bidi w:val="0"/>
-        <w:ind w:hanging="283" w:start="709"/>
-        <w:jc w:val="start"/>
-        <w:rPr/>
-      </w:pPr>
-      <w:r>
-        <w:rPr/>
+          <w:tab w:val="left" w:pos="709"/>
+        </w:tabs>
+        <w:ind w:left="709" w:hanging="283"/>
+        <w:jc w:val="start"/>
+      </w:pPr>
+      <w:r>
+        <w:rPr>
+          <w:rFonts w:ascii="Liberation Serif" w:hAnsi="Liberation Serif" w:eastAsia="Songti SC" w:cs="Arial Unicode MS"/>
+          <w:kern w:val="2"/>
+          <w:sz w:val="24"/>
+          <w:szCs w:val="24"/>
+        </w:rPr>
         <w:t>How do we log decisions?</w:t>
       </w:r>
     </w:p>
@@ -2147,15 +2583,18 @@
         </w:numPr>
         <w:tabs>
           <w:tab w:val="clear" w:pos="709"/>
-          <w:tab w:val="left" w:pos="709" w:leader="none"/>
-        </w:tabs>
-        <w:bidi w:val="0"/>
-        <w:ind w:hanging="283" w:start="709"/>
-        <w:jc w:val="start"/>
-        <w:rPr/>
-      </w:pPr>
-      <w:r>
-        <w:rPr/>
+          <w:tab w:val="left" w:pos="709"/>
+        </w:tabs>
+        <w:ind w:left="709" w:hanging="283"/>
+        <w:jc w:val="start"/>
+      </w:pPr>
+      <w:r>
+        <w:rPr>
+          <w:rFonts w:ascii="Liberation Serif" w:hAnsi="Liberation Serif" w:eastAsia="Songti SC" w:cs="Arial Unicode MS"/>
+          <w:kern w:val="2"/>
+          <w:sz w:val="24"/>
+          <w:szCs w:val="24"/>
+        </w:rPr>
         <w:t>How do we prevent bad actions?</w:t>
       </w:r>
     </w:p>
@@ -2168,75 +2607,95 @@
         </w:numPr>
         <w:tabs>
           <w:tab w:val="clear" w:pos="709"/>
-          <w:tab w:val="left" w:pos="709" w:leader="none"/>
-        </w:tabs>
-        <w:bidi w:val="0"/>
-        <w:ind w:hanging="283" w:start="709"/>
-        <w:jc w:val="start"/>
-        <w:rPr/>
-      </w:pPr>
-      <w:r>
-        <w:rPr/>
+          <w:tab w:val="left" w:pos="709"/>
+        </w:tabs>
+        <w:ind w:left="709" w:hanging="283"/>
+        <w:jc w:val="start"/>
+      </w:pPr>
+      <w:r>
+        <w:rPr>
+          <w:rFonts w:ascii="Liberation Serif" w:hAnsi="Liberation Serif" w:eastAsia="Songti SC" w:cs="Arial Unicode MS"/>
+          <w:kern w:val="2"/>
+          <w:sz w:val="24"/>
+          <w:szCs w:val="24"/>
+        </w:rPr>
         <w:t>How do we scale safely?</w:t>
       </w:r>
     </w:p>
     <w:p>
       <w:pPr>
         <w:pStyle w:val="BodyText"/>
-        <w:bidi w:val="0"/>
-        <w:jc w:val="start"/>
-        <w:rPr/>
-      </w:pPr>
-      <w:r>
-        <w:rPr/>
+        <w:jc w:val="start"/>
+      </w:pPr>
+      <w:r>
+        <w:rPr>
+          <w:rFonts w:ascii="Liberation Serif" w:hAnsi="Liberation Serif" w:eastAsia="Songti SC" w:cs="Arial Unicode MS"/>
+          <w:kern w:val="2"/>
+          <w:sz w:val="24"/>
+          <w:szCs w:val="24"/>
+        </w:rPr>
         <w:t>This is exactly why Amazon Bedrock AgentCore exists.</w:t>
       </w:r>
     </w:p>
     <w:p>
       <w:pPr>
         <w:pStyle w:val="BodyText"/>
-        <w:bidi w:val="0"/>
-        <w:jc w:val="start"/>
-        <w:rPr/>
-      </w:pPr>
-      <w:r>
-        <w:rPr/>
+        <w:jc w:val="start"/>
+      </w:pPr>
+      <w:r>
+        <w:rPr>
+          <w:rFonts w:ascii="Liberation Serif" w:hAnsi="Liberation Serif" w:eastAsia="Songti SC" w:cs="Arial Unicode MS"/>
+          <w:kern w:val="2"/>
+          <w:sz w:val="24"/>
+          <w:szCs w:val="24"/>
+        </w:rPr>
         <w:t>We'll dive into AgentCore in later chapters, but for now remember:</w:t>
       </w:r>
     </w:p>
     <w:p>
       <w:pPr>
         <w:pStyle w:val="BodyText"/>
-        <w:bidi w:val="0"/>
-        <w:jc w:val="start"/>
-        <w:rPr/>
-      </w:pPr>
-      <w:r>
-        <w:rPr/>
+        <w:jc w:val="start"/>
+      </w:pPr>
+      <w:r>
+        <w:rPr>
+          <w:rFonts w:ascii="Liberation Serif" w:hAnsi="Liberation Serif" w:eastAsia="Songti SC" w:cs="Arial Unicode MS"/>
+          <w:kern w:val="2"/>
+          <w:sz w:val="24"/>
+          <w:szCs w:val="24"/>
+        </w:rPr>
         <w:t>Bedrock gives us the brain. AgentCore helps us build the worker.</w:t>
       </w:r>
     </w:p>
     <w:p>
       <w:pPr>
         <w:pStyle w:val="Heading3"/>
-        <w:bidi w:val="0"/>
-        <w:jc w:val="start"/>
-        <w:rPr/>
-      </w:pPr>
-      <w:r>
-        <w:rPr/>
+        <w:jc w:val="start"/>
+      </w:pPr>
+      <w:r>
+        <w:rPr>
+          <w:rFonts w:ascii="Liberation Serif" w:hAnsi="Liberation Serif" w:eastAsia="Songti SC" w:cs="Arial Unicode MS"/>
+          <w:b/>
+          <w:bCs/>
+          <w:kern w:val="2"/>
+          <w:sz w:val="28"/>
+          <w:szCs w:val="28"/>
+        </w:rPr>
         <w:t>1.9 Knowledge Check</w:t>
       </w:r>
     </w:p>
     <w:p>
       <w:pPr>
         <w:pStyle w:val="BodyText"/>
-        <w:bidi w:val="0"/>
-        <w:jc w:val="start"/>
-        <w:rPr/>
-      </w:pPr>
-      <w:r>
-        <w:rPr/>
+        <w:jc w:val="start"/>
+      </w:pPr>
+      <w:r>
+        <w:rPr>
+          <w:rFonts w:ascii="Liberation Serif" w:hAnsi="Liberation Serif" w:eastAsia="Songti SC" w:cs="Arial Unicode MS"/>
+          <w:kern w:val="2"/>
+          <w:sz w:val="24"/>
+          <w:szCs w:val="24"/>
+        </w:rPr>
         <w:t>Quick Quiz</w:t>
       </w:r>
     </w:p>
@@ -2249,15 +2708,18 @@
         </w:numPr>
         <w:tabs>
           <w:tab w:val="clear" w:pos="709"/>
-          <w:tab w:val="left" w:pos="709" w:leader="none"/>
-        </w:tabs>
-        <w:bidi w:val="0"/>
-        <w:ind w:hanging="283" w:start="709"/>
-        <w:jc w:val="start"/>
-        <w:rPr/>
-      </w:pPr>
-      <w:r>
-        <w:rPr/>
+          <w:tab w:val="left" w:pos="709"/>
+        </w:tabs>
+        <w:ind w:left="709" w:hanging="283"/>
+        <w:jc w:val="start"/>
+      </w:pPr>
+      <w:r>
+        <w:rPr>
+          <w:rFonts w:ascii="Liberation Serif" w:hAnsi="Liberation Serif" w:eastAsia="Songti SC" w:cs="Arial Unicode MS"/>
+          <w:kern w:val="2"/>
+          <w:sz w:val="24"/>
+          <w:szCs w:val="24"/>
+        </w:rPr>
         <w:t>What is the difference between a chatbot and an AI agent?</w:t>
       </w:r>
     </w:p>
@@ -2270,15 +2732,18 @@
         </w:numPr>
         <w:tabs>
           <w:tab w:val="clear" w:pos="709"/>
-          <w:tab w:val="left" w:pos="709" w:leader="none"/>
-        </w:tabs>
-        <w:bidi w:val="0"/>
-        <w:ind w:hanging="283" w:start="709"/>
-        <w:jc w:val="start"/>
-        <w:rPr/>
-      </w:pPr>
-      <w:r>
-        <w:rPr/>
+          <w:tab w:val="left" w:pos="709"/>
+        </w:tabs>
+        <w:ind w:left="709" w:hanging="283"/>
+        <w:jc w:val="start"/>
+      </w:pPr>
+      <w:r>
+        <w:rPr>
+          <w:rFonts w:ascii="Liberation Serif" w:hAnsi="Liberation Serif" w:eastAsia="Songti SC" w:cs="Arial Unicode MS"/>
+          <w:kern w:val="2"/>
+          <w:sz w:val="24"/>
+          <w:szCs w:val="24"/>
+        </w:rPr>
         <w:t>Why can't a language model know your Airbnb availability by itself?</w:t>
       </w:r>
     </w:p>
@@ -2291,15 +2756,18 @@
         </w:numPr>
         <w:tabs>
           <w:tab w:val="clear" w:pos="709"/>
-          <w:tab w:val="left" w:pos="709" w:leader="none"/>
-        </w:tabs>
-        <w:bidi w:val="0"/>
-        <w:ind w:hanging="283" w:start="709"/>
-        <w:jc w:val="start"/>
-        <w:rPr/>
-      </w:pPr>
-      <w:r>
-        <w:rPr/>
+          <w:tab w:val="left" w:pos="709"/>
+        </w:tabs>
+        <w:ind w:left="709" w:hanging="283"/>
+        <w:jc w:val="start"/>
+      </w:pPr>
+      <w:r>
+        <w:rPr>
+          <w:rFonts w:ascii="Liberation Serif" w:hAnsi="Liberation Serif" w:eastAsia="Songti SC" w:cs="Arial Unicode MS"/>
+          <w:kern w:val="2"/>
+          <w:sz w:val="24"/>
+          <w:szCs w:val="24"/>
+        </w:rPr>
         <w:t>What are the four agent superpowers?</w:t>
       </w:r>
     </w:p>
@@ -2312,15 +2780,18 @@
         </w:numPr>
         <w:tabs>
           <w:tab w:val="clear" w:pos="709"/>
-          <w:tab w:val="left" w:pos="709" w:leader="none"/>
-        </w:tabs>
-        <w:bidi w:val="0"/>
-        <w:ind w:hanging="283" w:start="709"/>
-        <w:jc w:val="start"/>
-        <w:rPr/>
-      </w:pPr>
-      <w:r>
-        <w:rPr/>
+          <w:tab w:val="left" w:pos="709"/>
+        </w:tabs>
+        <w:ind w:left="709" w:hanging="283"/>
+        <w:jc w:val="start"/>
+      </w:pPr>
+      <w:r>
+        <w:rPr>
+          <w:rFonts w:ascii="Liberation Serif" w:hAnsi="Liberation Serif" w:eastAsia="Songti SC" w:cs="Arial Unicode MS"/>
+          <w:kern w:val="2"/>
+          <w:sz w:val="24"/>
+          <w:szCs w:val="24"/>
+        </w:rPr>
         <w:t>In our project, which capability checks the calendar?</w:t>
       </w:r>
     </w:p>
@@ -2333,27 +2804,33 @@
         </w:numPr>
         <w:tabs>
           <w:tab w:val="clear" w:pos="709"/>
-          <w:tab w:val="left" w:pos="709" w:leader="none"/>
-        </w:tabs>
-        <w:bidi w:val="0"/>
-        <w:ind w:hanging="283" w:start="709"/>
-        <w:jc w:val="start"/>
-        <w:rPr/>
-      </w:pPr>
-      <w:r>
-        <w:rPr/>
+          <w:tab w:val="left" w:pos="709"/>
+        </w:tabs>
+        <w:ind w:left="709" w:hanging="283"/>
+        <w:jc w:val="start"/>
+      </w:pPr>
+      <w:r>
+        <w:rPr>
+          <w:rFonts w:ascii="Liberation Serif" w:hAnsi="Liberation Serif" w:eastAsia="Songti SC" w:cs="Arial Unicode MS"/>
+          <w:kern w:val="2"/>
+          <w:sz w:val="24"/>
+          <w:szCs w:val="24"/>
+        </w:rPr>
         <w:t>What is the difference between the "brain" and the "hands"?</w:t>
       </w:r>
     </w:p>
     <w:p>
       <w:pPr>
         <w:pStyle w:val="BodyText"/>
-        <w:bidi w:val="0"/>
-        <w:jc w:val="start"/>
-        <w:rPr/>
-      </w:pPr>
-      <w:r>
-        <w:rPr/>
+        <w:jc w:val="start"/>
+      </w:pPr>
+      <w:r>
+        <w:rPr>
+          <w:rFonts w:ascii="Liberation Serif" w:hAnsi="Liberation Serif" w:eastAsia="Songti SC" w:cs="Arial Unicode MS"/>
+          <w:kern w:val="2"/>
+          <w:sz w:val="24"/>
+          <w:szCs w:val="24"/>
+        </w:rPr>
         <w:t>Answers</w:t>
       </w:r>
     </w:p>
@@ -2366,15 +2843,18 @@
         </w:numPr>
         <w:tabs>
           <w:tab w:val="clear" w:pos="709"/>
-          <w:tab w:val="left" w:pos="709" w:leader="none"/>
-        </w:tabs>
-        <w:bidi w:val="0"/>
-        <w:ind w:hanging="283" w:start="709"/>
-        <w:jc w:val="start"/>
-        <w:rPr/>
-      </w:pPr>
-      <w:r>
-        <w:rPr/>
+          <w:tab w:val="left" w:pos="709"/>
+        </w:tabs>
+        <w:ind w:left="709" w:hanging="283"/>
+        <w:jc w:val="start"/>
+      </w:pPr>
+      <w:r>
+        <w:rPr>
+          <w:rFonts w:ascii="Liberation Serif" w:hAnsi="Liberation Serif" w:eastAsia="Songti SC" w:cs="Arial Unicode MS"/>
+          <w:kern w:val="2"/>
+          <w:sz w:val="24"/>
+          <w:szCs w:val="24"/>
+        </w:rPr>
         <w:t>A chatbot mainly answers questions; an AI agent performs tasks and takes actions.</w:t>
       </w:r>
     </w:p>
@@ -2387,15 +2867,18 @@
         </w:numPr>
         <w:tabs>
           <w:tab w:val="clear" w:pos="709"/>
-          <w:tab w:val="left" w:pos="709" w:leader="none"/>
-        </w:tabs>
-        <w:bidi w:val="0"/>
-        <w:ind w:hanging="283" w:start="709"/>
-        <w:jc w:val="start"/>
-        <w:rPr/>
-      </w:pPr>
-      <w:r>
-        <w:rPr/>
+          <w:tab w:val="left" w:pos="709"/>
+        </w:tabs>
+        <w:ind w:left="709" w:hanging="283"/>
+        <w:jc w:val="start"/>
+      </w:pPr>
+      <w:r>
+        <w:rPr>
+          <w:rFonts w:ascii="Liberation Serif" w:hAnsi="Liberation Serif" w:eastAsia="Songti SC" w:cs="Arial Unicode MS"/>
+          <w:kern w:val="2"/>
+          <w:sz w:val="24"/>
+          <w:szCs w:val="24"/>
+        </w:rPr>
         <w:t>Because availability is real-time external data, not training knowledge.</w:t>
       </w:r>
     </w:p>
@@ -2408,15 +2891,18 @@
         </w:numPr>
         <w:tabs>
           <w:tab w:val="clear" w:pos="709"/>
-          <w:tab w:val="left" w:pos="709" w:leader="none"/>
-        </w:tabs>
-        <w:bidi w:val="0"/>
-        <w:ind w:hanging="283" w:start="709"/>
-        <w:jc w:val="start"/>
-        <w:rPr/>
-      </w:pPr>
-      <w:r>
-        <w:rPr/>
+          <w:tab w:val="left" w:pos="709"/>
+        </w:tabs>
+        <w:ind w:left="709" w:hanging="283"/>
+        <w:jc w:val="start"/>
+      </w:pPr>
+      <w:r>
+        <w:rPr>
+          <w:rFonts w:ascii="Liberation Serif" w:hAnsi="Liberation Serif" w:eastAsia="Songti SC" w:cs="Arial Unicode MS"/>
+          <w:kern w:val="2"/>
+          <w:sz w:val="24"/>
+          <w:szCs w:val="24"/>
+        </w:rPr>
         <w:t>Understand, Think, Use Tools, Act.</w:t>
       </w:r>
     </w:p>
@@ -2429,15 +2915,18 @@
         </w:numPr>
         <w:tabs>
           <w:tab w:val="clear" w:pos="709"/>
-          <w:tab w:val="left" w:pos="709" w:leader="none"/>
-        </w:tabs>
-        <w:bidi w:val="0"/>
-        <w:ind w:hanging="283" w:start="709"/>
-        <w:jc w:val="start"/>
-        <w:rPr/>
-      </w:pPr>
-      <w:r>
-        <w:rPr/>
+          <w:tab w:val="left" w:pos="709"/>
+        </w:tabs>
+        <w:ind w:left="709" w:hanging="283"/>
+        <w:jc w:val="start"/>
+      </w:pPr>
+      <w:r>
+        <w:rPr>
+          <w:rFonts w:ascii="Liberation Serif" w:hAnsi="Liberation Serif" w:eastAsia="Songti SC" w:cs="Arial Unicode MS"/>
+          <w:kern w:val="2"/>
+          <w:sz w:val="24"/>
+          <w:szCs w:val="24"/>
+        </w:rPr>
         <w:t>Use Tools.</w:t>
       </w:r>
     </w:p>
@@ -2450,39 +2939,50 @@
         </w:numPr>
         <w:tabs>
           <w:tab w:val="clear" w:pos="709"/>
-          <w:tab w:val="left" w:pos="709" w:leader="none"/>
-        </w:tabs>
-        <w:bidi w:val="0"/>
-        <w:ind w:hanging="283" w:start="709"/>
-        <w:jc w:val="start"/>
-        <w:rPr/>
-      </w:pPr>
-      <w:r>
-        <w:rPr/>
+          <w:tab w:val="left" w:pos="709"/>
+        </w:tabs>
+        <w:ind w:left="709" w:hanging="283"/>
+        <w:jc w:val="start"/>
+      </w:pPr>
+      <w:r>
+        <w:rPr>
+          <w:rFonts w:ascii="Liberation Serif" w:hAnsi="Liberation Serif" w:eastAsia="Songti SC" w:cs="Arial Unicode MS"/>
+          <w:kern w:val="2"/>
+          <w:sz w:val="24"/>
+          <w:szCs w:val="24"/>
+        </w:rPr>
         <w:t>The brain (LLM) reasons and generates language; the hands (tools) interact with external systems.</w:t>
       </w:r>
     </w:p>
     <w:p>
       <w:pPr>
         <w:pStyle w:val="Heading3"/>
-        <w:bidi w:val="0"/>
-        <w:jc w:val="start"/>
-        <w:rPr/>
-      </w:pPr>
-      <w:r>
-        <w:rPr/>
+        <w:jc w:val="start"/>
+      </w:pPr>
+      <w:r>
+        <w:rPr>
+          <w:rFonts w:ascii="Liberation Serif" w:hAnsi="Liberation Serif" w:eastAsia="Songti SC" w:cs="Arial Unicode MS"/>
+          <w:b/>
+          <w:bCs/>
+          <w:kern w:val="2"/>
+          <w:sz w:val="28"/>
+          <w:szCs w:val="28"/>
+        </w:rPr>
         <w:t>1.10 Chapter Summary</w:t>
       </w:r>
     </w:p>
     <w:p>
       <w:pPr>
         <w:pStyle w:val="BodyText"/>
-        <w:bidi w:val="0"/>
-        <w:jc w:val="start"/>
-        <w:rPr/>
-      </w:pPr>
-      <w:r>
-        <w:rPr/>
+        <w:jc w:val="start"/>
+      </w:pPr>
+      <w:r>
+        <w:rPr>
+          <w:rFonts w:ascii="Liberation Serif" w:hAnsi="Liberation Serif" w:eastAsia="Songti SC" w:cs="Arial Unicode MS"/>
+          <w:kern w:val="2"/>
+          <w:sz w:val="24"/>
+          <w:szCs w:val="24"/>
+        </w:rPr>
         <w:t>You learned</w:t>
       </w:r>
     </w:p>
@@ -2495,15 +2995,18 @@
         </w:numPr>
         <w:tabs>
           <w:tab w:val="clear" w:pos="709"/>
-          <w:tab w:val="left" w:pos="709" w:leader="none"/>
-        </w:tabs>
-        <w:bidi w:val="0"/>
-        <w:ind w:hanging="283" w:start="709"/>
-        <w:jc w:val="start"/>
-        <w:rPr/>
-      </w:pPr>
-      <w:r>
-        <w:rPr/>
+          <w:tab w:val="left" w:pos="709"/>
+        </w:tabs>
+        <w:ind w:left="709" w:hanging="283"/>
+        <w:jc w:val="start"/>
+      </w:pPr>
+      <w:r>
+        <w:rPr>
+          <w:rFonts w:ascii="Liberation Serif" w:hAnsi="Liberation Serif" w:eastAsia="Songti SC" w:cs="Arial Unicode MS"/>
+          <w:kern w:val="2"/>
+          <w:sz w:val="24"/>
+          <w:szCs w:val="24"/>
+        </w:rPr>
         <w:t>Generative AI creates content.</w:t>
       </w:r>
     </w:p>
@@ -2516,15 +3019,18 @@
         </w:numPr>
         <w:tabs>
           <w:tab w:val="clear" w:pos="709"/>
-          <w:tab w:val="left" w:pos="709" w:leader="none"/>
-        </w:tabs>
-        <w:bidi w:val="0"/>
-        <w:ind w:hanging="283" w:start="709"/>
-        <w:jc w:val="start"/>
-        <w:rPr/>
-      </w:pPr>
-      <w:r>
-        <w:rPr/>
+          <w:tab w:val="left" w:pos="709"/>
+        </w:tabs>
+        <w:ind w:left="709" w:hanging="283"/>
+        <w:jc w:val="start"/>
+      </w:pPr>
+      <w:r>
+        <w:rPr>
+          <w:rFonts w:ascii="Liberation Serif" w:hAnsi="Liberation Serif" w:eastAsia="Songti SC" w:cs="Arial Unicode MS"/>
+          <w:kern w:val="2"/>
+          <w:sz w:val="24"/>
+          <w:szCs w:val="24"/>
+        </w:rPr>
         <w:t>An AI Agent creates content and performs actions.</w:t>
       </w:r>
     </w:p>
@@ -2537,15 +3043,18 @@
         </w:numPr>
         <w:tabs>
           <w:tab w:val="clear" w:pos="709"/>
-          <w:tab w:val="left" w:pos="709" w:leader="none"/>
-        </w:tabs>
-        <w:bidi w:val="0"/>
-        <w:ind w:hanging="283" w:start="709"/>
-        <w:jc w:val="start"/>
-        <w:rPr/>
-      </w:pPr>
-      <w:r>
-        <w:rPr/>
+          <w:tab w:val="left" w:pos="709"/>
+        </w:tabs>
+        <w:ind w:left="709" w:hanging="283"/>
+        <w:jc w:val="start"/>
+      </w:pPr>
+      <w:r>
+        <w:rPr>
+          <w:rFonts w:ascii="Liberation Serif" w:hAnsi="Liberation Serif" w:eastAsia="Songti SC" w:cs="Arial Unicode MS"/>
+          <w:kern w:val="2"/>
+          <w:sz w:val="24"/>
+          <w:szCs w:val="24"/>
+        </w:rPr>
         <w:t>Agentic systems combine reasoning + tools + actions.</w:t>
       </w:r>
     </w:p>
@@ -2558,15 +3067,18 @@
         </w:numPr>
         <w:tabs>
           <w:tab w:val="clear" w:pos="709"/>
-          <w:tab w:val="left" w:pos="709" w:leader="none"/>
-        </w:tabs>
-        <w:bidi w:val="0"/>
-        <w:ind w:hanging="283" w:start="709"/>
-        <w:jc w:val="start"/>
-        <w:rPr/>
-      </w:pPr>
-      <w:r>
-        <w:rPr/>
+          <w:tab w:val="left" w:pos="709"/>
+        </w:tabs>
+        <w:ind w:left="709" w:hanging="283"/>
+        <w:jc w:val="start"/>
+      </w:pPr>
+      <w:r>
+        <w:rPr>
+          <w:rFonts w:ascii="Liberation Serif" w:hAnsi="Liberation Serif" w:eastAsia="Songti SC" w:cs="Arial Unicode MS"/>
+          <w:kern w:val="2"/>
+          <w:sz w:val="24"/>
+          <w:szCs w:val="24"/>
+        </w:rPr>
         <w:t>The LLM is the brain; external tools are the hands.</w:t>
       </w:r>
     </w:p>
@@ -2579,63 +3091,80 @@
         </w:numPr>
         <w:tabs>
           <w:tab w:val="clear" w:pos="709"/>
-          <w:tab w:val="left" w:pos="709" w:leader="none"/>
-        </w:tabs>
-        <w:bidi w:val="0"/>
-        <w:ind w:hanging="283" w:start="709"/>
-        <w:jc w:val="start"/>
-        <w:rPr/>
-      </w:pPr>
-      <w:r>
-        <w:rPr/>
+          <w:tab w:val="left" w:pos="709"/>
+        </w:tabs>
+        <w:ind w:left="709" w:hanging="283"/>
+        <w:jc w:val="start"/>
+      </w:pPr>
+      <w:r>
+        <w:rPr>
+          <w:rFonts w:ascii="Liberation Serif" w:hAnsi="Liberation Serif" w:eastAsia="Songti SC" w:cs="Arial Unicode MS"/>
+          <w:kern w:val="2"/>
+          <w:sz w:val="24"/>
+          <w:szCs w:val="24"/>
+        </w:rPr>
         <w:t>Your Facebook Airbnb system is fundamentally an AI employee, not a chatbot.</w:t>
       </w:r>
     </w:p>
     <w:p>
       <w:pPr>
         <w:pStyle w:val="Heading3"/>
-        <w:bidi w:val="0"/>
-        <w:jc w:val="start"/>
-        <w:rPr/>
-      </w:pPr>
-      <w:r>
-        <w:rPr/>
+        <w:jc w:val="start"/>
+      </w:pPr>
+      <w:r>
+        <w:rPr>
+          <w:rFonts w:ascii="Liberation Serif" w:hAnsi="Liberation Serif" w:eastAsia="Songti SC" w:cs="Arial Unicode MS"/>
+          <w:b/>
+          <w:bCs/>
+          <w:kern w:val="2"/>
+          <w:sz w:val="28"/>
+          <w:szCs w:val="28"/>
+        </w:rPr>
         <w:t>Coming Next</w:t>
       </w:r>
     </w:p>
     <w:p>
       <w:pPr>
         <w:pStyle w:val="BodyText"/>
-        <w:bidi w:val="0"/>
-        <w:jc w:val="start"/>
-        <w:rPr/>
-      </w:pPr>
-      <w:r>
-        <w:rPr/>
+        <w:jc w:val="start"/>
+      </w:pPr>
+      <w:r>
+        <w:rPr>
+          <w:rFonts w:ascii="Liberation Serif" w:hAnsi="Liberation Serif" w:eastAsia="Songti SC" w:cs="Arial Unicode MS"/>
+          <w:kern w:val="2"/>
+          <w:sz w:val="24"/>
+          <w:szCs w:val="24"/>
+        </w:rPr>
         <w:t>In Chapter 2 — The Evolution from Automation to AI Agents, we'll answer a deeper question:</w:t>
       </w:r>
     </w:p>
     <w:p>
       <w:pPr>
         <w:pStyle w:val="BodyText"/>
-        <w:bidi w:val="0"/>
-        <w:jc w:val="start"/>
-        <w:rPr/>
-      </w:pPr>
-      <w:r>
-        <w:rPr/>
+        <w:jc w:val="start"/>
+      </w:pPr>
+      <w:r>
+        <w:rPr>
+          <w:rFonts w:ascii="Liberation Serif" w:hAnsi="Liberation Serif" w:eastAsia="Songti SC" w:cs="Arial Unicode MS"/>
+          <w:kern w:val="2"/>
+          <w:sz w:val="24"/>
+          <w:szCs w:val="24"/>
+        </w:rPr>
         <w:t>"If we can already automate workflows with code, why do we need AI agents at all?"</w:t>
       </w:r>
     </w:p>
     <w:p>
       <w:pPr>
         <w:pStyle w:val="BodyText"/>
-        <w:bidi w:val="0"/>
-        <w:jc w:val="start"/>
-        <w:rPr/>
-      </w:pPr>
-      <w:r>
-        <w:rPr/>
+        <w:jc w:val="start"/>
+      </w:pPr>
+      <w:r>
+        <w:rPr>
+          <w:rFonts w:ascii="Liberation Serif" w:hAnsi="Liberation Serif" w:eastAsia="Songti SC" w:cs="Arial Unicode MS"/>
+          <w:kern w:val="2"/>
+          <w:sz w:val="24"/>
+          <w:szCs w:val="24"/>
+        </w:rPr>
         <w:t>You'll learn the difference between:</w:t>
       </w:r>
     </w:p>
@@ -2648,15 +3177,18 @@
         </w:numPr>
         <w:tabs>
           <w:tab w:val="clear" w:pos="709"/>
-          <w:tab w:val="left" w:pos="709" w:leader="none"/>
-        </w:tabs>
-        <w:bidi w:val="0"/>
-        <w:ind w:hanging="283" w:start="709"/>
-        <w:jc w:val="start"/>
-        <w:rPr/>
-      </w:pPr>
-      <w:r>
-        <w:rPr/>
+          <w:tab w:val="left" w:pos="709"/>
+        </w:tabs>
+        <w:ind w:left="709" w:hanging="283"/>
+        <w:jc w:val="start"/>
+      </w:pPr>
+      <w:r>
+        <w:rPr>
+          <w:rFonts w:ascii="Liberation Serif" w:hAnsi="Liberation Serif" w:eastAsia="Songti SC" w:cs="Arial Unicode MS"/>
+          <w:kern w:val="2"/>
+          <w:sz w:val="24"/>
+          <w:szCs w:val="24"/>
+        </w:rPr>
         <w:t>Traditional automation</w:t>
       </w:r>
     </w:p>
@@ -2669,15 +3201,18 @@
         </w:numPr>
         <w:tabs>
           <w:tab w:val="clear" w:pos="709"/>
-          <w:tab w:val="left" w:pos="709" w:leader="none"/>
-        </w:tabs>
-        <w:bidi w:val="0"/>
-        <w:ind w:hanging="283" w:start="709"/>
-        <w:jc w:val="start"/>
-        <w:rPr/>
-      </w:pPr>
-      <w:r>
-        <w:rPr/>
+          <w:tab w:val="left" w:pos="709"/>
+        </w:tabs>
+        <w:ind w:left="709" w:hanging="283"/>
+        <w:jc w:val="start"/>
+      </w:pPr>
+      <w:r>
+        <w:rPr>
+          <w:rFonts w:ascii="Liberation Serif" w:hAnsi="Liberation Serif" w:eastAsia="Songti SC" w:cs="Arial Unicode MS"/>
+          <w:kern w:val="2"/>
+          <w:sz w:val="24"/>
+          <w:szCs w:val="24"/>
+        </w:rPr>
         <w:t>Rule-based systems</w:t>
       </w:r>
     </w:p>
@@ -2690,15 +3225,18 @@
         </w:numPr>
         <w:tabs>
           <w:tab w:val="clear" w:pos="709"/>
-          <w:tab w:val="left" w:pos="709" w:leader="none"/>
-        </w:tabs>
-        <w:bidi w:val="0"/>
-        <w:ind w:hanging="283" w:start="709"/>
-        <w:jc w:val="start"/>
-        <w:rPr/>
-      </w:pPr>
-      <w:r>
-        <w:rPr/>
+          <w:tab w:val="left" w:pos="709"/>
+        </w:tabs>
+        <w:ind w:left="709" w:hanging="283"/>
+        <w:jc w:val="start"/>
+      </w:pPr>
+      <w:r>
+        <w:rPr>
+          <w:rFonts w:ascii="Liberation Serif" w:hAnsi="Liberation Serif" w:eastAsia="Songti SC" w:cs="Arial Unicode MS"/>
+          <w:kern w:val="2"/>
+          <w:sz w:val="24"/>
+          <w:szCs w:val="24"/>
+        </w:rPr>
         <w:t>AI-assisted workflows</w:t>
       </w:r>
     </w:p>
@@ -2711,60 +3249,62 @@
         </w:numPr>
         <w:tabs>
           <w:tab w:val="clear" w:pos="709"/>
-          <w:tab w:val="left" w:pos="709" w:leader="none"/>
-        </w:tabs>
-        <w:bidi w:val="0"/>
-        <w:ind w:hanging="283" w:start="709"/>
-        <w:jc w:val="start"/>
-        <w:rPr/>
-      </w:pPr>
-      <w:r>
-        <w:rPr/>
+          <w:tab w:val="left" w:pos="709"/>
+        </w:tabs>
+        <w:ind w:left="709" w:hanging="283"/>
+        <w:jc w:val="start"/>
+      </w:pPr>
+      <w:r>
+        <w:rPr>
+          <w:rFonts w:ascii="Liberation Serif" w:hAnsi="Liberation Serif" w:eastAsia="Songti SC" w:cs="Arial Unicode MS"/>
+          <w:kern w:val="2"/>
+          <w:sz w:val="24"/>
+          <w:szCs w:val="24"/>
+        </w:rPr>
         <w:t>Fully agentic systems</w:t>
       </w:r>
     </w:p>
     <w:p>
       <w:pPr>
         <w:pStyle w:val="BodyText"/>
-        <w:bidi w:val="0"/>
-        <w:jc w:val="start"/>
-        <w:rPr/>
-      </w:pPr>
-      <w:r>
-        <w:rPr/>
+        <w:jc w:val="start"/>
+      </w:pPr>
+      <w:r>
+        <w:rPr>
+          <w:rFonts w:ascii="Liberation Serif" w:hAnsi="Liberation Serif" w:eastAsia="Songti SC" w:cs="Arial Unicode MS"/>
+          <w:kern w:val="2"/>
+          <w:sz w:val="24"/>
+          <w:szCs w:val="24"/>
+        </w:rPr>
         <w:t>That chapter will give you the architectural mindset used by modern AI engineering teams.</w:t>
       </w:r>
     </w:p>
     <w:p>
       <w:pPr>
         <w:pStyle w:val="BodyText"/>
-        <w:bidi w:val="0"/>
-        <w:jc w:val="start"/>
-        <w:rPr/>
-      </w:pPr>
-      <w:r>
-        <w:rPr/>
+        <w:jc w:val="start"/>
+      </w:pPr>
+      <w:r>
+        <w:rPr>
+          <w:rFonts w:ascii="Liberation Serif" w:hAnsi="Liberation Serif" w:eastAsia="Songti SC" w:cs="Arial Unicode MS"/>
+          <w:kern w:val="2"/>
+          <w:sz w:val="24"/>
+          <w:szCs w:val="24"/>
+        </w:rPr>
         <w:t>End of Module 1 — Chapter 1</w:t>
       </w:r>
     </w:p>
     <w:p>
       <w:pPr>
         <w:pStyle w:val="Normal"/>
-        <w:bidi w:val="0"/>
-        <w:jc w:val="start"/>
-        <w:rPr/>
-      </w:pPr>
-      <w:r>
-        <w:rPr/>
-      </w:r>
+        <w:jc w:val="start"/>
+      </w:pPr>
+      <w:r/>
     </w:p>
     <w:sectPr>
       <w:type w:val="nextPage"/>
       <w:pgSz w:w="12240" w:h="15840"/>
-      <w:pgMar w:left="1134" w:right="1134" w:gutter="0" w:header="0" w:top="1134" w:footer="0" w:bottom="1134"/>
-      <w:pgNumType w:fmt="decimal"/>
-      <w:formProt w:val="false"/>
-      <w:textDirection w:val="lrTb"/>
+      <w:pgMar w:top="1134" w:right="1134" w:bottom="1134" w:left="1134" w:header="0" w:footer="0" w:gutter="0"/>
     </w:sectPr>
   </w:body>
 </w:document>

</xml_diff>